<commit_message>
Model ERR_PTR returns; add seeded-bug evaluation on real kernel modules
IS_ERR()/ERR_PTR handling in the path search cuts warnings on real Linux
modules from 115 to 64 with no benchmark change. New 'klg seed' command
reintroduces a known leak into real kernel code and runs detect, confirm and
fix against the unmodified baseline. Real-module runtime re-run, triage,
report sections 4.4-4.6, slides, README and manual updated.
</commit_message>
<xml_diff>
--- a/docs/KernelLeakGuard_Final_Report.docx
+++ b/docs/KernelLeakGuard_Final_Report.docx
@@ -1055,7 +1055,7 @@
       <w:r>
         <w:fldChar w:fldCharType="separate"/>
       </w:r>
-      <w:hyperlink w:anchor="_Toc243002862" w:history="1">
+      <w:hyperlink w:anchor="_Toc243006962" w:history="1">
         <w:r>
           <w:rPr>
             <w:rStyle w:val="Hyperlink"/>
@@ -1082,7 +1082,7 @@
             <w:noProof/>
             <w:webHidden/>
           </w:rPr>
-          <w:instrText xml:space="preserve"> PAGEREF _Toc243002862 \h </w:instrText>
+          <w:instrText xml:space="preserve"> PAGEREF _Toc243006962 \h </w:instrText>
         </w:r>
         <w:r>
           <w:rPr>
@@ -1126,7 +1126,7 @@
           <w:lang w:eastAsia="en-IN"/>
         </w:rPr>
       </w:pPr>
-      <w:hyperlink w:anchor="_Toc243002863" w:history="1">
+      <w:hyperlink w:anchor="_Toc243006963" w:history="1">
         <w:r>
           <w:rPr>
             <w:rStyle w:val="Hyperlink"/>
@@ -1153,7 +1153,7 @@
             <w:noProof/>
             <w:webHidden/>
           </w:rPr>
-          <w:instrText xml:space="preserve"> PAGEREF _Toc243002863 \h </w:instrText>
+          <w:instrText xml:space="preserve"> PAGEREF _Toc243006963 \h </w:instrText>
         </w:r>
         <w:r>
           <w:rPr>
@@ -1197,7 +1197,7 @@
           <w:lang w:eastAsia="en-IN"/>
         </w:rPr>
       </w:pPr>
-      <w:hyperlink w:anchor="_Toc243002864" w:history="1">
+      <w:hyperlink w:anchor="_Toc243006964" w:history="1">
         <w:r>
           <w:rPr>
             <w:rStyle w:val="Hyperlink"/>
@@ -1224,7 +1224,7 @@
             <w:noProof/>
             <w:webHidden/>
           </w:rPr>
-          <w:instrText xml:space="preserve"> PAGEREF _Toc243002864 \h </w:instrText>
+          <w:instrText xml:space="preserve"> PAGEREF _Toc243006964 \h </w:instrText>
         </w:r>
         <w:r>
           <w:rPr>
@@ -1268,7 +1268,7 @@
           <w:lang w:eastAsia="en-IN"/>
         </w:rPr>
       </w:pPr>
-      <w:hyperlink w:anchor="_Toc243002865" w:history="1">
+      <w:hyperlink w:anchor="_Toc243006965" w:history="1">
         <w:r>
           <w:rPr>
             <w:rStyle w:val="Hyperlink"/>
@@ -1295,7 +1295,7 @@
             <w:noProof/>
             <w:webHidden/>
           </w:rPr>
-          <w:instrText xml:space="preserve"> PAGEREF _Toc243002865 \h </w:instrText>
+          <w:instrText xml:space="preserve"> PAGEREF _Toc243006965 \h </w:instrText>
         </w:r>
         <w:r>
           <w:rPr>
@@ -1339,7 +1339,7 @@
           <w:lang w:eastAsia="en-IN"/>
         </w:rPr>
       </w:pPr>
-      <w:hyperlink w:anchor="_Toc243002866" w:history="1">
+      <w:hyperlink w:anchor="_Toc243006966" w:history="1">
         <w:r>
           <w:rPr>
             <w:rStyle w:val="Hyperlink"/>
@@ -1366,7 +1366,7 @@
             <w:noProof/>
             <w:webHidden/>
           </w:rPr>
-          <w:instrText xml:space="preserve"> PAGEREF _Toc243002866 \h </w:instrText>
+          <w:instrText xml:space="preserve"> PAGEREF _Toc243006966 \h </w:instrText>
         </w:r>
         <w:r>
           <w:rPr>
@@ -1410,7 +1410,7 @@
           <w:lang w:eastAsia="en-IN"/>
         </w:rPr>
       </w:pPr>
-      <w:hyperlink w:anchor="_Toc243002867" w:history="1">
+      <w:hyperlink w:anchor="_Toc243006967" w:history="1">
         <w:r>
           <w:rPr>
             <w:rStyle w:val="Hyperlink"/>
@@ -1437,7 +1437,7 @@
             <w:noProof/>
             <w:webHidden/>
           </w:rPr>
-          <w:instrText xml:space="preserve"> PAGEREF _Toc243002867 \h </w:instrText>
+          <w:instrText xml:space="preserve"> PAGEREF _Toc243006967 \h </w:instrText>
         </w:r>
         <w:r>
           <w:rPr>
@@ -1481,7 +1481,7 @@
           <w:lang w:eastAsia="en-IN"/>
         </w:rPr>
       </w:pPr>
-      <w:hyperlink w:anchor="_Toc243002868" w:history="1">
+      <w:hyperlink w:anchor="_Toc243006968" w:history="1">
         <w:r>
           <w:rPr>
             <w:rStyle w:val="Hyperlink"/>
@@ -1508,7 +1508,7 @@
             <w:noProof/>
             <w:webHidden/>
           </w:rPr>
-          <w:instrText xml:space="preserve"> PAGEREF _Toc243002868 \h </w:instrText>
+          <w:instrText xml:space="preserve"> PAGEREF _Toc243006968 \h </w:instrText>
         </w:r>
         <w:r>
           <w:rPr>
@@ -1552,7 +1552,7 @@
           <w:lang w:eastAsia="en-IN"/>
         </w:rPr>
       </w:pPr>
-      <w:hyperlink w:anchor="_Toc243002869" w:history="1">
+      <w:hyperlink w:anchor="_Toc243006969" w:history="1">
         <w:r>
           <w:rPr>
             <w:rStyle w:val="Hyperlink"/>
@@ -1579,7 +1579,7 @@
             <w:noProof/>
             <w:webHidden/>
           </w:rPr>
-          <w:instrText xml:space="preserve"> PAGEREF _Toc243002869 \h </w:instrText>
+          <w:instrText xml:space="preserve"> PAGEREF _Toc243006969 \h </w:instrText>
         </w:r>
         <w:r>
           <w:rPr>
@@ -1623,7 +1623,7 @@
           <w:lang w:eastAsia="en-IN"/>
         </w:rPr>
       </w:pPr>
-      <w:hyperlink w:anchor="_Toc243002870" w:history="1">
+      <w:hyperlink w:anchor="_Toc243006970" w:history="1">
         <w:r>
           <w:rPr>
             <w:rStyle w:val="Hyperlink"/>
@@ -1650,7 +1650,7 @@
             <w:noProof/>
             <w:webHidden/>
           </w:rPr>
-          <w:instrText xml:space="preserve"> PAGEREF _Toc243002870 \h </w:instrText>
+          <w:instrText xml:space="preserve"> PAGEREF _Toc243006970 \h </w:instrText>
         </w:r>
         <w:r>
           <w:rPr>
@@ -1694,7 +1694,7 @@
           <w:lang w:eastAsia="en-IN"/>
         </w:rPr>
       </w:pPr>
-      <w:hyperlink w:anchor="_Toc243002871" w:history="1">
+      <w:hyperlink w:anchor="_Toc243006971" w:history="1">
         <w:r>
           <w:rPr>
             <w:rStyle w:val="Hyperlink"/>
@@ -1721,7 +1721,7 @@
             <w:noProof/>
             <w:webHidden/>
           </w:rPr>
-          <w:instrText xml:space="preserve"> PAGEREF _Toc243002871 \h </w:instrText>
+          <w:instrText xml:space="preserve"> PAGEREF _Toc243006971 \h </w:instrText>
         </w:r>
         <w:r>
           <w:rPr>
@@ -1765,7 +1765,7 @@
           <w:lang w:eastAsia="en-IN"/>
         </w:rPr>
       </w:pPr>
-      <w:hyperlink w:anchor="_Toc243002872" w:history="1">
+      <w:hyperlink w:anchor="_Toc243006972" w:history="1">
         <w:r>
           <w:rPr>
             <w:rStyle w:val="Hyperlink"/>
@@ -1792,7 +1792,7 @@
             <w:noProof/>
             <w:webHidden/>
           </w:rPr>
-          <w:instrText xml:space="preserve"> PAGEREF _Toc243002872 \h </w:instrText>
+          <w:instrText xml:space="preserve"> PAGEREF _Toc243006972 \h </w:instrText>
         </w:r>
         <w:r>
           <w:rPr>
@@ -1836,7 +1836,7 @@
           <w:lang w:eastAsia="en-IN"/>
         </w:rPr>
       </w:pPr>
-      <w:hyperlink w:anchor="_Toc243002873" w:history="1">
+      <w:hyperlink w:anchor="_Toc243006973" w:history="1">
         <w:r>
           <w:rPr>
             <w:rStyle w:val="Hyperlink"/>
@@ -1863,7 +1863,7 @@
             <w:noProof/>
             <w:webHidden/>
           </w:rPr>
-          <w:instrText xml:space="preserve"> PAGEREF _Toc243002873 \h </w:instrText>
+          <w:instrText xml:space="preserve"> PAGEREF _Toc243006973 \h </w:instrText>
         </w:r>
         <w:r>
           <w:rPr>
@@ -1907,7 +1907,7 @@
           <w:lang w:eastAsia="en-IN"/>
         </w:rPr>
       </w:pPr>
-      <w:hyperlink w:anchor="_Toc243002874" w:history="1">
+      <w:hyperlink w:anchor="_Toc243006974" w:history="1">
         <w:r>
           <w:rPr>
             <w:rStyle w:val="Hyperlink"/>
@@ -1934,7 +1934,7 @@
             <w:noProof/>
             <w:webHidden/>
           </w:rPr>
-          <w:instrText xml:space="preserve"> PAGEREF _Toc243002874 \h </w:instrText>
+          <w:instrText xml:space="preserve"> PAGEREF _Toc243006974 \h </w:instrText>
         </w:r>
         <w:r>
           <w:rPr>
@@ -1978,7 +1978,7 @@
           <w:lang w:eastAsia="en-IN"/>
         </w:rPr>
       </w:pPr>
-      <w:hyperlink w:anchor="_Toc243002875" w:history="1">
+      <w:hyperlink w:anchor="_Toc243006975" w:history="1">
         <w:r>
           <w:rPr>
             <w:rStyle w:val="Hyperlink"/>
@@ -2005,7 +2005,7 @@
             <w:noProof/>
             <w:webHidden/>
           </w:rPr>
-          <w:instrText xml:space="preserve"> PAGEREF _Toc243002875 \h </w:instrText>
+          <w:instrText xml:space="preserve"> PAGEREF _Toc243006975 \h </w:instrText>
         </w:r>
         <w:r>
           <w:rPr>
@@ -2049,7 +2049,7 @@
           <w:lang w:eastAsia="en-IN"/>
         </w:rPr>
       </w:pPr>
-      <w:hyperlink w:anchor="_Toc243002876" w:history="1">
+      <w:hyperlink w:anchor="_Toc243006976" w:history="1">
         <w:r>
           <w:rPr>
             <w:rStyle w:val="Hyperlink"/>
@@ -2076,7 +2076,7 @@
             <w:noProof/>
             <w:webHidden/>
           </w:rPr>
-          <w:instrText xml:space="preserve"> PAGEREF _Toc243002876 \h </w:instrText>
+          <w:instrText xml:space="preserve"> PAGEREF _Toc243006976 \h </w:instrText>
         </w:r>
         <w:r>
           <w:rPr>
@@ -2120,7 +2120,7 @@
           <w:lang w:eastAsia="en-IN"/>
         </w:rPr>
       </w:pPr>
-      <w:hyperlink w:anchor="_Toc243002877" w:history="1">
+      <w:hyperlink w:anchor="_Toc243006977" w:history="1">
         <w:r>
           <w:rPr>
             <w:rStyle w:val="Hyperlink"/>
@@ -2147,7 +2147,7 @@
             <w:noProof/>
             <w:webHidden/>
           </w:rPr>
-          <w:instrText xml:space="preserve"> PAGEREF _Toc243002877 \h </w:instrText>
+          <w:instrText xml:space="preserve"> PAGEREF _Toc243006977 \h </w:instrText>
         </w:r>
         <w:r>
           <w:rPr>
@@ -2191,7 +2191,7 @@
           <w:lang w:eastAsia="en-IN"/>
         </w:rPr>
       </w:pPr>
-      <w:hyperlink w:anchor="_Toc243002878" w:history="1">
+      <w:hyperlink w:anchor="_Toc243006978" w:history="1">
         <w:r>
           <w:rPr>
             <w:rStyle w:val="Hyperlink"/>
@@ -2218,7 +2218,7 @@
             <w:noProof/>
             <w:webHidden/>
           </w:rPr>
-          <w:instrText xml:space="preserve"> PAGEREF _Toc243002878 \h </w:instrText>
+          <w:instrText xml:space="preserve"> PAGEREF _Toc243006978 \h </w:instrText>
         </w:r>
         <w:r>
           <w:rPr>
@@ -2262,7 +2262,7 @@
           <w:lang w:eastAsia="en-IN"/>
         </w:rPr>
       </w:pPr>
-      <w:hyperlink w:anchor="_Toc243002879" w:history="1">
+      <w:hyperlink w:anchor="_Toc243006979" w:history="1">
         <w:r>
           <w:rPr>
             <w:rStyle w:val="Hyperlink"/>
@@ -2289,7 +2289,7 @@
             <w:noProof/>
             <w:webHidden/>
           </w:rPr>
-          <w:instrText xml:space="preserve"> PAGEREF _Toc243002879 \h </w:instrText>
+          <w:instrText xml:space="preserve"> PAGEREF _Toc243006979 \h </w:instrText>
         </w:r>
         <w:r>
           <w:rPr>
@@ -2333,7 +2333,7 @@
           <w:lang w:eastAsia="en-IN"/>
         </w:rPr>
       </w:pPr>
-      <w:hyperlink w:anchor="_Toc243002880" w:history="1">
+      <w:hyperlink w:anchor="_Toc243006980" w:history="1">
         <w:r>
           <w:rPr>
             <w:rStyle w:val="Hyperlink"/>
@@ -2360,7 +2360,7 @@
             <w:noProof/>
             <w:webHidden/>
           </w:rPr>
-          <w:instrText xml:space="preserve"> PAGEREF _Toc243002880 \h </w:instrText>
+          <w:instrText xml:space="preserve"> PAGEREF _Toc243006980 \h </w:instrText>
         </w:r>
         <w:r>
           <w:rPr>
@@ -2380,7 +2380,7 @@
             <w:noProof/>
             <w:webHidden/>
           </w:rPr>
-          <w:t>18</w:t>
+          <w:t>19</w:t>
         </w:r>
         <w:r>
           <w:rPr>
@@ -2404,7 +2404,7 @@
           <w:lang w:eastAsia="en-IN"/>
         </w:rPr>
       </w:pPr>
-      <w:hyperlink w:anchor="_Toc243002881" w:history="1">
+      <w:hyperlink w:anchor="_Toc243006981" w:history="1">
         <w:r>
           <w:rPr>
             <w:rStyle w:val="Hyperlink"/>
@@ -2431,7 +2431,7 @@
             <w:noProof/>
             <w:webHidden/>
           </w:rPr>
-          <w:instrText xml:space="preserve"> PAGEREF _Toc243002881 \h </w:instrText>
+          <w:instrText xml:space="preserve"> PAGEREF _Toc243006981 \h </w:instrText>
         </w:r>
         <w:r>
           <w:rPr>
@@ -2451,7 +2451,7 @@
             <w:noProof/>
             <w:webHidden/>
           </w:rPr>
-          <w:t>18</w:t>
+          <w:t>19</w:t>
         </w:r>
         <w:r>
           <w:rPr>
@@ -2475,7 +2475,7 @@
           <w:lang w:eastAsia="en-IN"/>
         </w:rPr>
       </w:pPr>
-      <w:hyperlink w:anchor="_Toc243002882" w:history="1">
+      <w:hyperlink w:anchor="_Toc243006982" w:history="1">
         <w:r>
           <w:rPr>
             <w:rStyle w:val="Hyperlink"/>
@@ -2502,7 +2502,7 @@
             <w:noProof/>
             <w:webHidden/>
           </w:rPr>
-          <w:instrText xml:space="preserve"> PAGEREF _Toc243002882 \h </w:instrText>
+          <w:instrText xml:space="preserve"> PAGEREF _Toc243006982 \h </w:instrText>
         </w:r>
         <w:r>
           <w:rPr>
@@ -2522,7 +2522,7 @@
             <w:noProof/>
             <w:webHidden/>
           </w:rPr>
-          <w:t>18</w:t>
+          <w:t>19</w:t>
         </w:r>
         <w:r>
           <w:rPr>
@@ -2546,7 +2546,7 @@
           <w:lang w:eastAsia="en-IN"/>
         </w:rPr>
       </w:pPr>
-      <w:hyperlink w:anchor="_Toc243002883" w:history="1">
+      <w:hyperlink w:anchor="_Toc243006983" w:history="1">
         <w:r>
           <w:rPr>
             <w:rStyle w:val="Hyperlink"/>
@@ -2573,78 +2573,7 @@
             <w:noProof/>
             <w:webHidden/>
           </w:rPr>
-          <w:instrText xml:space="preserve"> PAGEREF _Toc243002883 \h </w:instrText>
-        </w:r>
-        <w:r>
-          <w:rPr>
-            <w:noProof/>
-            <w:webHidden/>
-          </w:rPr>
-        </w:r>
-        <w:r>
-          <w:rPr>
-            <w:noProof/>
-            <w:webHidden/>
-          </w:rPr>
-          <w:fldChar w:fldCharType="separate"/>
-        </w:r>
-        <w:r>
-          <w:rPr>
-            <w:noProof/>
-            <w:webHidden/>
-          </w:rPr>
-          <w:t>25</w:t>
-        </w:r>
-        <w:r>
-          <w:rPr>
-            <w:noProof/>
-            <w:webHidden/>
-          </w:rPr>
-          <w:fldChar w:fldCharType="end"/>
-        </w:r>
-      </w:hyperlink>
-    </w:p>
-    <w:p>
-      <w:pPr>
-        <w:pStyle w:val="TOC2"/>
-        <w:tabs>
-          <w:tab w:val="right" w:leader="dot" w:pos="9016"/>
-        </w:tabs>
-        <w:rPr>
-          <w:rFonts w:asciiTheme="minorHAnsi" w:eastAsiaTheme="minorEastAsia" w:hAnsiTheme="minorHAnsi"/>
-          <w:noProof/>
-          <w:szCs w:val="24"/>
-          <w:lang w:eastAsia="en-IN"/>
-        </w:rPr>
-      </w:pPr>
-      <w:hyperlink w:anchor="_Toc243002884" w:history="1">
-        <w:r>
-          <w:rPr>
-            <w:rStyle w:val="Hyperlink"/>
-            <w:noProof/>
-          </w:rPr>
-          <w:t>4.4 Evaluation on Real Kernel Code</w:t>
-        </w:r>
-        <w:r>
-          <w:rPr>
-            <w:noProof/>
-            <w:webHidden/>
-          </w:rPr>
-          <w:tab/>
-        </w:r>
-        <w:r>
-          <w:rPr>
-            <w:noProof/>
-            <w:webHidden/>
-          </w:rPr>
-          <w:fldChar w:fldCharType="begin"/>
-        </w:r>
-        <w:r>
-          <w:rPr>
-            <w:noProof/>
-            <w:webHidden/>
-          </w:rPr>
-          <w:instrText xml:space="preserve"> PAGEREF _Toc243002884 \h </w:instrText>
+          <w:instrText xml:space="preserve"> PAGEREF _Toc243006983 \h </w:instrText>
         </w:r>
         <w:r>
           <w:rPr>
@@ -2688,13 +2617,13 @@
           <w:lang w:eastAsia="en-IN"/>
         </w:rPr>
       </w:pPr>
-      <w:hyperlink w:anchor="_Toc243002885" w:history="1">
+      <w:hyperlink w:anchor="_Toc243006984" w:history="1">
         <w:r>
           <w:rPr>
             <w:rStyle w:val="Hyperlink"/>
             <w:noProof/>
           </w:rPr>
-          <w:t>4.5 Analysis</w:t>
+          <w:t>4.4 Evaluation on Real Kernel Code</w:t>
         </w:r>
         <w:r>
           <w:rPr>
@@ -2715,7 +2644,7 @@
             <w:noProof/>
             <w:webHidden/>
           </w:rPr>
-          <w:instrText xml:space="preserve"> PAGEREF _Toc243002885 \h </w:instrText>
+          <w:instrText xml:space="preserve"> PAGEREF _Toc243006984 \h </w:instrText>
         </w:r>
         <w:r>
           <w:rPr>
@@ -2735,7 +2664,7 @@
             <w:noProof/>
             <w:webHidden/>
           </w:rPr>
-          <w:t>28</w:t>
+          <w:t>27</w:t>
         </w:r>
         <w:r>
           <w:rPr>
@@ -2748,7 +2677,7 @@
     </w:p>
     <w:p>
       <w:pPr>
-        <w:pStyle w:val="TOC1"/>
+        <w:pStyle w:val="TOC2"/>
         <w:tabs>
           <w:tab w:val="right" w:leader="dot" w:pos="9016"/>
         </w:tabs>
@@ -2759,13 +2688,13 @@
           <w:lang w:eastAsia="en-IN"/>
         </w:rPr>
       </w:pPr>
-      <w:hyperlink w:anchor="_Toc243002886" w:history="1">
+      <w:hyperlink w:anchor="_Toc243006985" w:history="1">
         <w:r>
           <w:rPr>
             <w:rStyle w:val="Hyperlink"/>
             <w:noProof/>
           </w:rPr>
-          <w:t>CHAPTER 5: CONCLUSION AND FUTURE WORK</w:t>
+          <w:t>4.5 Seeded Leaks in Real Kernel Code</w:t>
         </w:r>
         <w:r>
           <w:rPr>
@@ -2786,7 +2715,78 @@
             <w:noProof/>
             <w:webHidden/>
           </w:rPr>
-          <w:instrText xml:space="preserve"> PAGEREF _Toc243002886 \h </w:instrText>
+          <w:instrText xml:space="preserve"> PAGEREF _Toc243006985 \h </w:instrText>
+        </w:r>
+        <w:r>
+          <w:rPr>
+            <w:noProof/>
+            <w:webHidden/>
+          </w:rPr>
+        </w:r>
+        <w:r>
+          <w:rPr>
+            <w:noProof/>
+            <w:webHidden/>
+          </w:rPr>
+          <w:fldChar w:fldCharType="separate"/>
+        </w:r>
+        <w:r>
+          <w:rPr>
+            <w:noProof/>
+            <w:webHidden/>
+          </w:rPr>
+          <w:t>29</w:t>
+        </w:r>
+        <w:r>
+          <w:rPr>
+            <w:noProof/>
+            <w:webHidden/>
+          </w:rPr>
+          <w:fldChar w:fldCharType="end"/>
+        </w:r>
+      </w:hyperlink>
+    </w:p>
+    <w:p>
+      <w:pPr>
+        <w:pStyle w:val="TOC2"/>
+        <w:tabs>
+          <w:tab w:val="right" w:leader="dot" w:pos="9016"/>
+        </w:tabs>
+        <w:rPr>
+          <w:rFonts w:asciiTheme="minorHAnsi" w:eastAsiaTheme="minorEastAsia" w:hAnsiTheme="minorHAnsi"/>
+          <w:noProof/>
+          <w:szCs w:val="24"/>
+          <w:lang w:eastAsia="en-IN"/>
+        </w:rPr>
+      </w:pPr>
+      <w:hyperlink w:anchor="_Toc243006986" w:history="1">
+        <w:r>
+          <w:rPr>
+            <w:rStyle w:val="Hyperlink"/>
+            <w:noProof/>
+          </w:rPr>
+          <w:t>4.6 Analysis</w:t>
+        </w:r>
+        <w:r>
+          <w:rPr>
+            <w:noProof/>
+            <w:webHidden/>
+          </w:rPr>
+          <w:tab/>
+        </w:r>
+        <w:r>
+          <w:rPr>
+            <w:noProof/>
+            <w:webHidden/>
+          </w:rPr>
+          <w:fldChar w:fldCharType="begin"/>
+        </w:r>
+        <w:r>
+          <w:rPr>
+            <w:noProof/>
+            <w:webHidden/>
+          </w:rPr>
+          <w:instrText xml:space="preserve"> PAGEREF _Toc243006986 \h </w:instrText>
         </w:r>
         <w:r>
           <w:rPr>
@@ -2819,7 +2819,7 @@
     </w:p>
     <w:p>
       <w:pPr>
-        <w:pStyle w:val="TOC2"/>
+        <w:pStyle w:val="TOC1"/>
         <w:tabs>
           <w:tab w:val="right" w:leader="dot" w:pos="9016"/>
         </w:tabs>
@@ -2830,13 +2830,13 @@
           <w:lang w:eastAsia="en-IN"/>
         </w:rPr>
       </w:pPr>
-      <w:hyperlink w:anchor="_Toc243002887" w:history="1">
+      <w:hyperlink w:anchor="_Toc243006987" w:history="1">
         <w:r>
           <w:rPr>
             <w:rStyle w:val="Hyperlink"/>
             <w:noProof/>
           </w:rPr>
-          <w:t>5.1 Conclusion</w:t>
+          <w:t>CHAPTER 5: CONCLUSION AND FUTURE WORK</w:t>
         </w:r>
         <w:r>
           <w:rPr>
@@ -2857,149 +2857,7 @@
             <w:noProof/>
             <w:webHidden/>
           </w:rPr>
-          <w:instrText xml:space="preserve"> PAGEREF _Toc243002887 \h </w:instrText>
-        </w:r>
-        <w:r>
-          <w:rPr>
-            <w:noProof/>
-            <w:webHidden/>
-          </w:rPr>
-        </w:r>
-        <w:r>
-          <w:rPr>
-            <w:noProof/>
-            <w:webHidden/>
-          </w:rPr>
-          <w:fldChar w:fldCharType="separate"/>
-        </w:r>
-        <w:r>
-          <w:rPr>
-            <w:noProof/>
-            <w:webHidden/>
-          </w:rPr>
-          <w:t>30</w:t>
-        </w:r>
-        <w:r>
-          <w:rPr>
-            <w:noProof/>
-            <w:webHidden/>
-          </w:rPr>
-          <w:fldChar w:fldCharType="end"/>
-        </w:r>
-      </w:hyperlink>
-    </w:p>
-    <w:p>
-      <w:pPr>
-        <w:pStyle w:val="TOC2"/>
-        <w:tabs>
-          <w:tab w:val="right" w:leader="dot" w:pos="9016"/>
-        </w:tabs>
-        <w:rPr>
-          <w:rFonts w:asciiTheme="minorHAnsi" w:eastAsiaTheme="minorEastAsia" w:hAnsiTheme="minorHAnsi"/>
-          <w:noProof/>
-          <w:szCs w:val="24"/>
-          <w:lang w:eastAsia="en-IN"/>
-        </w:rPr>
-      </w:pPr>
-      <w:hyperlink w:anchor="_Toc243002888" w:history="1">
-        <w:r>
-          <w:rPr>
-            <w:rStyle w:val="Hyperlink"/>
-            <w:noProof/>
-          </w:rPr>
-          <w:t>5.2 Future Work</w:t>
-        </w:r>
-        <w:r>
-          <w:rPr>
-            <w:noProof/>
-            <w:webHidden/>
-          </w:rPr>
-          <w:tab/>
-        </w:r>
-        <w:r>
-          <w:rPr>
-            <w:noProof/>
-            <w:webHidden/>
-          </w:rPr>
-          <w:fldChar w:fldCharType="begin"/>
-        </w:r>
-        <w:r>
-          <w:rPr>
-            <w:noProof/>
-            <w:webHidden/>
-          </w:rPr>
-          <w:instrText xml:space="preserve"> PAGEREF _Toc243002888 \h </w:instrText>
-        </w:r>
-        <w:r>
-          <w:rPr>
-            <w:noProof/>
-            <w:webHidden/>
-          </w:rPr>
-        </w:r>
-        <w:r>
-          <w:rPr>
-            <w:noProof/>
-            <w:webHidden/>
-          </w:rPr>
-          <w:fldChar w:fldCharType="separate"/>
-        </w:r>
-        <w:r>
-          <w:rPr>
-            <w:noProof/>
-            <w:webHidden/>
-          </w:rPr>
-          <w:t>30</w:t>
-        </w:r>
-        <w:r>
-          <w:rPr>
-            <w:noProof/>
-            <w:webHidden/>
-          </w:rPr>
-          <w:fldChar w:fldCharType="end"/>
-        </w:r>
-      </w:hyperlink>
-    </w:p>
-    <w:p>
-      <w:pPr>
-        <w:pStyle w:val="TOC1"/>
-        <w:tabs>
-          <w:tab w:val="right" w:leader="dot" w:pos="9016"/>
-        </w:tabs>
-        <w:rPr>
-          <w:rFonts w:asciiTheme="minorHAnsi" w:eastAsiaTheme="minorEastAsia" w:hAnsiTheme="minorHAnsi"/>
-          <w:noProof/>
-          <w:szCs w:val="24"/>
-          <w:lang w:eastAsia="en-IN"/>
-        </w:rPr>
-      </w:pPr>
-      <w:hyperlink w:anchor="_Toc243002889" w:history="1">
-        <w:r>
-          <w:rPr>
-            <w:rStyle w:val="Hyperlink"/>
-            <w:noProof/>
-          </w:rPr>
-          <w:t>REFERENCES</w:t>
-        </w:r>
-        <w:r>
-          <w:rPr>
-            <w:noProof/>
-            <w:webHidden/>
-          </w:rPr>
-          <w:tab/>
-        </w:r>
-        <w:r>
-          <w:rPr>
-            <w:noProof/>
-            <w:webHidden/>
-          </w:rPr>
-          <w:fldChar w:fldCharType="begin"/>
-        </w:r>
-        <w:r>
-          <w:rPr>
-            <w:noProof/>
-            <w:webHidden/>
-          </w:rPr>
-          <w:instrText xml:space="preserve"> PAGEREF _Toc243002889 \h </w:instrText>
+          <w:instrText xml:space="preserve"> PAGEREF _Toc243006987 \h </w:instrText>
         </w:r>
         <w:r>
           <w:rPr>
@@ -3032,7 +2890,7 @@
     </w:p>
     <w:p>
       <w:pPr>
-        <w:pStyle w:val="TOC1"/>
+        <w:pStyle w:val="TOC2"/>
         <w:tabs>
           <w:tab w:val="right" w:leader="dot" w:pos="9016"/>
         </w:tabs>
@@ -3043,13 +2901,13 @@
           <w:lang w:eastAsia="en-IN"/>
         </w:rPr>
       </w:pPr>
-      <w:hyperlink w:anchor="_Toc243002890" w:history="1">
+      <w:hyperlink w:anchor="_Toc243006988" w:history="1">
         <w:r>
           <w:rPr>
             <w:rStyle w:val="Hyperlink"/>
             <w:noProof/>
           </w:rPr>
-          <w:t>APPENDIX: SOURCE CODE</w:t>
+          <w:t>5.1 Conclusion</w:t>
         </w:r>
         <w:r>
           <w:rPr>
@@ -3070,7 +2928,149 @@
             <w:noProof/>
             <w:webHidden/>
           </w:rPr>
-          <w:instrText xml:space="preserve"> PAGEREF _Toc243002890 \h </w:instrText>
+          <w:instrText xml:space="preserve"> PAGEREF _Toc243006988 \h </w:instrText>
+        </w:r>
+        <w:r>
+          <w:rPr>
+            <w:noProof/>
+            <w:webHidden/>
+          </w:rPr>
+        </w:r>
+        <w:r>
+          <w:rPr>
+            <w:noProof/>
+            <w:webHidden/>
+          </w:rPr>
+          <w:fldChar w:fldCharType="separate"/>
+        </w:r>
+        <w:r>
+          <w:rPr>
+            <w:noProof/>
+            <w:webHidden/>
+          </w:rPr>
+          <w:t>32</w:t>
+        </w:r>
+        <w:r>
+          <w:rPr>
+            <w:noProof/>
+            <w:webHidden/>
+          </w:rPr>
+          <w:fldChar w:fldCharType="end"/>
+        </w:r>
+      </w:hyperlink>
+    </w:p>
+    <w:p>
+      <w:pPr>
+        <w:pStyle w:val="TOC2"/>
+        <w:tabs>
+          <w:tab w:val="right" w:leader="dot" w:pos="9016"/>
+        </w:tabs>
+        <w:rPr>
+          <w:rFonts w:asciiTheme="minorHAnsi" w:eastAsiaTheme="minorEastAsia" w:hAnsiTheme="minorHAnsi"/>
+          <w:noProof/>
+          <w:szCs w:val="24"/>
+          <w:lang w:eastAsia="en-IN"/>
+        </w:rPr>
+      </w:pPr>
+      <w:hyperlink w:anchor="_Toc243006989" w:history="1">
+        <w:r>
+          <w:rPr>
+            <w:rStyle w:val="Hyperlink"/>
+            <w:noProof/>
+          </w:rPr>
+          <w:t>5.2 Future Work</w:t>
+        </w:r>
+        <w:r>
+          <w:rPr>
+            <w:noProof/>
+            <w:webHidden/>
+          </w:rPr>
+          <w:tab/>
+        </w:r>
+        <w:r>
+          <w:rPr>
+            <w:noProof/>
+            <w:webHidden/>
+          </w:rPr>
+          <w:fldChar w:fldCharType="begin"/>
+        </w:r>
+        <w:r>
+          <w:rPr>
+            <w:noProof/>
+            <w:webHidden/>
+          </w:rPr>
+          <w:instrText xml:space="preserve"> PAGEREF _Toc243006989 \h </w:instrText>
+        </w:r>
+        <w:r>
+          <w:rPr>
+            <w:noProof/>
+            <w:webHidden/>
+          </w:rPr>
+        </w:r>
+        <w:r>
+          <w:rPr>
+            <w:noProof/>
+            <w:webHidden/>
+          </w:rPr>
+          <w:fldChar w:fldCharType="separate"/>
+        </w:r>
+        <w:r>
+          <w:rPr>
+            <w:noProof/>
+            <w:webHidden/>
+          </w:rPr>
+          <w:t>32</w:t>
+        </w:r>
+        <w:r>
+          <w:rPr>
+            <w:noProof/>
+            <w:webHidden/>
+          </w:rPr>
+          <w:fldChar w:fldCharType="end"/>
+        </w:r>
+      </w:hyperlink>
+    </w:p>
+    <w:p>
+      <w:pPr>
+        <w:pStyle w:val="TOC1"/>
+        <w:tabs>
+          <w:tab w:val="right" w:leader="dot" w:pos="9016"/>
+        </w:tabs>
+        <w:rPr>
+          <w:rFonts w:asciiTheme="minorHAnsi" w:eastAsiaTheme="minorEastAsia" w:hAnsiTheme="minorHAnsi"/>
+          <w:noProof/>
+          <w:szCs w:val="24"/>
+          <w:lang w:eastAsia="en-IN"/>
+        </w:rPr>
+      </w:pPr>
+      <w:hyperlink w:anchor="_Toc243006990" w:history="1">
+        <w:r>
+          <w:rPr>
+            <w:rStyle w:val="Hyperlink"/>
+            <w:noProof/>
+          </w:rPr>
+          <w:t>REFERENCES</w:t>
+        </w:r>
+        <w:r>
+          <w:rPr>
+            <w:noProof/>
+            <w:webHidden/>
+          </w:rPr>
+          <w:tab/>
+        </w:r>
+        <w:r>
+          <w:rPr>
+            <w:noProof/>
+            <w:webHidden/>
+          </w:rPr>
+          <w:fldChar w:fldCharType="begin"/>
+        </w:r>
+        <w:r>
+          <w:rPr>
+            <w:noProof/>
+            <w:webHidden/>
+          </w:rPr>
+          <w:instrText xml:space="preserve"> PAGEREF _Toc243006990 \h </w:instrText>
         </w:r>
         <w:r>
           <w:rPr>
@@ -3102,6 +3102,77 @@
       </w:hyperlink>
     </w:p>
     <w:p>
+      <w:pPr>
+        <w:pStyle w:val="TOC1"/>
+        <w:tabs>
+          <w:tab w:val="right" w:leader="dot" w:pos="9016"/>
+        </w:tabs>
+        <w:rPr>
+          <w:rFonts w:asciiTheme="minorHAnsi" w:eastAsiaTheme="minorEastAsia" w:hAnsiTheme="minorHAnsi"/>
+          <w:noProof/>
+          <w:szCs w:val="24"/>
+          <w:lang w:eastAsia="en-IN"/>
+        </w:rPr>
+      </w:pPr>
+      <w:hyperlink w:anchor="_Toc243006991" w:history="1">
+        <w:r>
+          <w:rPr>
+            <w:rStyle w:val="Hyperlink"/>
+            <w:noProof/>
+          </w:rPr>
+          <w:t>APPENDIX: SOURCE CODE</w:t>
+        </w:r>
+        <w:r>
+          <w:rPr>
+            <w:noProof/>
+            <w:webHidden/>
+          </w:rPr>
+          <w:tab/>
+        </w:r>
+        <w:r>
+          <w:rPr>
+            <w:noProof/>
+            <w:webHidden/>
+          </w:rPr>
+          <w:fldChar w:fldCharType="begin"/>
+        </w:r>
+        <w:r>
+          <w:rPr>
+            <w:noProof/>
+            <w:webHidden/>
+          </w:rPr>
+          <w:instrText xml:space="preserve"> PAGEREF _Toc243006991 \h </w:instrText>
+        </w:r>
+        <w:r>
+          <w:rPr>
+            <w:noProof/>
+            <w:webHidden/>
+          </w:rPr>
+        </w:r>
+        <w:r>
+          <w:rPr>
+            <w:noProof/>
+            <w:webHidden/>
+          </w:rPr>
+          <w:fldChar w:fldCharType="separate"/>
+        </w:r>
+        <w:r>
+          <w:rPr>
+            <w:noProof/>
+            <w:webHidden/>
+          </w:rPr>
+          <w:t>36</w:t>
+        </w:r>
+        <w:r>
+          <w:rPr>
+            <w:noProof/>
+            <w:webHidden/>
+          </w:rPr>
+          <w:fldChar w:fldCharType="end"/>
+        </w:r>
+      </w:hyperlink>
+    </w:p>
+    <w:p>
       <w:r>
         <w:fldChar w:fldCharType="end"/>
       </w:r>
@@ -3208,7 +3279,7 @@
         <w:pageBreakBefore/>
         <w:jc w:val="center"/>
       </w:pPr>
-      <w:bookmarkStart w:id="0" w:name="_Toc243002862"/>
+      <w:bookmarkStart w:id="0" w:name="_Toc243006962"/>
       <w:r>
         <w:lastRenderedPageBreak/>
         <w:t>ABSTRACT</w:t>
@@ -3272,7 +3343,7 @@
         <w:pageBreakBefore/>
         <w:jc w:val="center"/>
       </w:pPr>
-      <w:bookmarkStart w:id="1" w:name="_Toc243002863"/>
+      <w:bookmarkStart w:id="1" w:name="_Toc243006963"/>
       <w:r>
         <w:lastRenderedPageBreak/>
         <w:t>CHAPTER 1: INTRODUCTION</w:t>
@@ -3283,7 +3354,7 @@
       <w:pPr>
         <w:pStyle w:val="Heading2"/>
       </w:pPr>
-      <w:bookmarkStart w:id="2" w:name="_Toc243002864"/>
+      <w:bookmarkStart w:id="2" w:name="_Toc243006964"/>
       <w:r>
         <w:t>1.1 Motivation</w:t>
       </w:r>
@@ -3332,7 +3403,7 @@
       <w:pPr>
         <w:pStyle w:val="Heading2"/>
       </w:pPr>
-      <w:bookmarkStart w:id="3" w:name="_Toc243002865"/>
+      <w:bookmarkStart w:id="3" w:name="_Toc243006965"/>
       <w:r>
         <w:t>1.2 Scope</w:t>
       </w:r>
@@ -3391,7 +3462,7 @@
       <w:pPr>
         <w:pStyle w:val="Heading2"/>
       </w:pPr>
-      <w:bookmarkStart w:id="4" w:name="_Toc243002866"/>
+      <w:bookmarkStart w:id="4" w:name="_Toc243006966"/>
       <w:r>
         <w:t>1.3 Problem Statement</w:t>
       </w:r>
@@ -3412,7 +3483,7 @@
       <w:pPr>
         <w:pStyle w:val="Heading2"/>
       </w:pPr>
-      <w:bookmarkStart w:id="5" w:name="_Toc243002867"/>
+      <w:bookmarkStart w:id="5" w:name="_Toc243006967"/>
       <w:r>
         <w:t>1.4 Objectives</w:t>
       </w:r>
@@ -3536,7 +3607,7 @@
       <w:pPr>
         <w:pStyle w:val="Heading2"/>
       </w:pPr>
-      <w:bookmarkStart w:id="6" w:name="_Toc243002868"/>
+      <w:bookmarkStart w:id="6" w:name="_Toc243006968"/>
       <w:r>
         <w:t>1.5 Organization of the Report</w:t>
       </w:r>
@@ -3566,7 +3637,7 @@
         <w:pageBreakBefore/>
         <w:jc w:val="center"/>
       </w:pPr>
-      <w:bookmarkStart w:id="7" w:name="_Toc243002869"/>
+      <w:bookmarkStart w:id="7" w:name="_Toc243006969"/>
       <w:r>
         <w:lastRenderedPageBreak/>
         <w:t>CHAPTER 2: LITERATURE SURVEY</w:t>
@@ -3577,7 +3648,7 @@
       <w:pPr>
         <w:pStyle w:val="Heading2"/>
       </w:pPr>
-      <w:bookmarkStart w:id="8" w:name="_Toc243002870"/>
+      <w:bookmarkStart w:id="8" w:name="_Toc243006970"/>
       <w:r>
         <w:t>2.1 Overview</w:t>
       </w:r>
@@ -3604,7 +3675,7 @@
       <w:pPr>
         <w:pStyle w:val="Heading2"/>
       </w:pPr>
-      <w:bookmarkStart w:id="9" w:name="_Toc243002871"/>
+      <w:bookmarkStart w:id="9" w:name="_Toc243006971"/>
       <w:r>
         <w:t>2.2 Review of Existing Methods</w:t>
       </w:r>
@@ -3741,7 +3812,7 @@
       <w:pPr>
         <w:pStyle w:val="Heading2"/>
       </w:pPr>
-      <w:bookmarkStart w:id="10" w:name="_Toc243002872"/>
+      <w:bookmarkStart w:id="10" w:name="_Toc243006972"/>
       <w:r>
         <w:t>2.3 Comparative Analysis</w:t>
       </w:r>
@@ -4515,7 +4586,7 @@
       <w:pPr>
         <w:pStyle w:val="Heading2"/>
       </w:pPr>
-      <w:bookmarkStart w:id="11" w:name="_Toc243002873"/>
+      <w:bookmarkStart w:id="11" w:name="_Toc243006973"/>
       <w:r>
         <w:t>2.4 Research Gap</w:t>
       </w:r>
@@ -4556,7 +4627,7 @@
         <w:pageBreakBefore/>
         <w:jc w:val="center"/>
       </w:pPr>
-      <w:bookmarkStart w:id="12" w:name="_Toc243002874"/>
+      <w:bookmarkStart w:id="12" w:name="_Toc243006974"/>
       <w:r>
         <w:lastRenderedPageBreak/>
         <w:t>CHAPTER 3: PROPOSED TECHNIQUE</w:t>
@@ -4567,7 +4638,7 @@
       <w:pPr>
         <w:pStyle w:val="Heading2"/>
       </w:pPr>
-      <w:bookmarkStart w:id="13" w:name="_Toc243002875"/>
+      <w:bookmarkStart w:id="13" w:name="_Toc243006975"/>
       <w:r>
         <w:t>3.1 System Architecture</w:t>
       </w:r>
@@ -4594,7 +4665,7 @@
           <w:noProof/>
         </w:rPr>
         <w:drawing>
-          <wp:inline distT="0" distB="0" distL="0" distR="0" wp14:anchorId="182DA25B" wp14:editId="29BA4837">
+          <wp:inline distT="0" distB="0" distL="0" distR="0" wp14:anchorId="065B7637" wp14:editId="7DD2CB8E">
             <wp:extent cx="5940000" cy="3024000"/>
             <wp:effectExtent l="0" t="0" r="0" b="0"/>
             <wp:docPr id="9" name="Picture 9"/>
@@ -4787,7 +4858,7 @@
       <w:pPr>
         <w:pStyle w:val="Heading2"/>
       </w:pPr>
-      <w:bookmarkStart w:id="14" w:name="_Toc243002876"/>
+      <w:bookmarkStart w:id="14" w:name="_Toc243006976"/>
       <w:r>
         <w:lastRenderedPageBreak/>
         <w:t>3.2 Module-wise Description</w:t>
@@ -4920,7 +4991,7 @@
         <w:rPr>
           <w:rFonts w:cs="Times New Roman"/>
         </w:rPr>
-        <w:t>a depth-first search from the allocation to every return, pruning the edge on which the allocation itself failed (NULL check) and edges that contradict an earlier decision on the same condition (branch correlation, seeded with the dominating conditions that guard the allocation). Loops are unrolled twice; a second execution of the allocation creates a new instance while the earlier one stays reachable through memory.</w:t>
+        <w:t>a depth-first search from the allocation to every return, pruning the edge on which the allocation itself failed (a NULL check, or an IS_ERR() check when the value is an ERR_PTR error code) and edges that contradict an earlier decision on the same condition (branch correlation, seeded with the dominating conditions that guard the allocation). Loops are unrolled twice; a second execution of the allocation creates a new instance while the earlier one stays reachable through memory.</w:t>
       </w:r>
     </w:p>
     <w:p>
@@ -4954,6 +5025,7 @@
         <w:pStyle w:val="Heading3"/>
       </w:pPr>
       <w:r>
+        <w:lastRenderedPageBreak/>
         <w:t>3.2.2 Guest kernel and virtual machine - Abhishek Kumar Singh</w:t>
       </w:r>
     </w:p>
@@ -4965,20 +5037,70 @@
         <w:rPr>
           <w:rFonts w:cs="Times New Roman"/>
         </w:rPr>
-        <w:t xml:space="preserve">Linux 6.18.55 LTS is built with clang from defconfig, the KVM guest fragment and the KernelLeakGuard fragment (vm/kernel.config.fragment): kmemleak without automatic </w:t>
+        <w:t>Linux 6.18.55 LTS is built with clang from defconfig, the KVM guest fragment and the KernelLeakGuard fragment (vm/kernel.config.fragment): kmemleak without automatic scanning, fault injection with failslab, fail_function and fail_usercopy, ftrace-based kprobes and virtio-9p sharing. Several settings make kmemleak trustworthy by removing stale copies of pointers that would make a leaked object look referenced: thread stacks come from the page allocator (CONFIG_VMAP_STACK=n), kernel stacks are erased on retur</w:t>
       </w:r>
       <w:r>
         <w:rPr>
           <w:rFonts w:cs="Times New Roman"/>
         </w:rPr>
+        <w:t>n to user space (CONFIG_KSTACK_ERASE), kmemleak does not scan task stacks, and slab memory is zeroed on allocation and free (init_on_alloc=1 init_on_free=1). The guest boots from a busybox initramfs in about two seconds, mounts the host directory over 9p, configures fault injection through debugfs and runs the job script generated by the host.</w:t>
+      </w:r>
+    </w:p>
+    <w:p>
+      <w:pPr>
+        <w:pStyle w:val="Heading3"/>
+      </w:pPr>
+      <w:r>
+        <w:t>3.2.3 Fault-injection agent (klg-agent, C) - Abhishek Kumar Singh</w:t>
+      </w:r>
+    </w:p>
+    <w:p>
+      <w:pPr>
+        <w:jc w:val="both"/>
+      </w:pPr>
+      <w:r>
+        <w:rPr>
+          <w:rFonts w:cs="Times New Roman"/>
+        </w:rPr>
+        <w:t xml:space="preserve">klg-agent is a statically linked C program that drives one kernel routine at a time. In sweep mode it writes N to /proc/thread-self/fail-nth, runs the routine (writing to the module's debugfs trigger file or loading the module with finit_module()), reads fail-nth back to learn whether the fault fired, and records the kernel log lines of the attempt. In repeat mode it injects a chosen fault several times and, when given the expected stack frame, verifies that the fault landed there and probes neighbouring N </w:t>
+      </w:r>
+      <w:r>
+        <w:rPr>
+          <w:rFonts w:cs="Times New Roman"/>
+        </w:rPr>
+        <w:t xml:space="preserve">if fault numbering drifted between boots. A random mode enables probabilistic faults for the task only around the target system call, for the random baseline. With --filter the agent sets the fault-injection stack-trace filter (require-start / require-end) to the target module's code, so only the module's own fault points are counted; the module's layout comes from klg_modwatch, a helper kernel module that uses a module notifier to log every module's load address and function symbols. The same log lets the </w:t>
+      </w:r>
+      <w:r>
+        <w:rPr>
+          <w:rFonts w:cs="Times New Roman"/>
+        </w:rPr>
+        <w:t>host resolve kmemleak backtraces of modules that were already unloaded. Before each attempt the agent writes a marker to the host, so that if the guest kernel crashes or hangs, the host records the faulting fault point, reboots the VM and resumes.</w:t>
+      </w:r>
+    </w:p>
+    <w:p>
+      <w:pPr>
+        <w:pStyle w:val="Heading3"/>
+      </w:pPr>
+      <w:r>
+        <w:t>3.2.4 Verifier, evaluation and dashboard (Python) - Aarav Jain</w:t>
+      </w:r>
+    </w:p>
+    <w:p>
+      <w:pPr>
+        <w:jc w:val="both"/>
+      </w:pPr>
+      <w:r>
+        <w:rPr>
+          <w:rFonts w:cs="Times New Roman"/>
+        </w:rPr>
+        <w:t xml:space="preserve">The klg package builds modules and IR, runs the analyser, generates the guest job scripts, boots the VM, symbolises stack frames with the kernel's faddr2line script, plans the confirmation tests, schedules them in kmemleak rounds so that leaks can be attributed unambiguously, and computes verdicts and metrics. The Streamlit dashboard lists findings with verdicts, highlights </w:t>
+      </w:r>
+      <w:r>
+        <w:rPr>
+          <w:rFonts w:cs="Times New Roman"/>
+        </w:rPr>
         <w:lastRenderedPageBreak/>
-        <w:t>scanning, fault injection with failslab, fail_function and fail_usercopy, ftrace-based kprobes and virtio-9p sharing. Several settings make kmemleak trustworthy by removing stale copies of pointers that would make a leaked object look referenced: thread stacks come from the page allocator (CONFIG_VMAP_STACK=n), kernel stacks are erased on return to user space (CONFIG_KSTACK_ERASE), kmemleak does not scan task stacks, and slab memory is zeroed on allocation and free (init_on_alloc=1 init_on_free=1). The gues</w:t>
-      </w:r>
-      <w:r>
-        <w:rPr>
-          <w:rFonts w:cs="Times New Roman"/>
-        </w:rPr>
-        <w:t>t boots from a busybox initramfs in about two seconds, mounts the host directory over 9p, configures fault injection through debugfs and runs the job script generated by the host.</w:t>
+        <w:t>the allocation, failing call and leaking exit in the source, shows the kmemleak backtraces, compares approaches and can run the pipeline.</w:t>
       </w:r>
     </w:p>
     <w:p>
@@ -4986,63 +5108,6 @@
         <w:pStyle w:val="Heading3"/>
       </w:pPr>
       <w:r>
-        <w:t>3.2.3 Fault-injection agent (klg-agent, C) - Abhishek Kumar Singh</w:t>
-      </w:r>
-    </w:p>
-    <w:p>
-      <w:pPr>
-        <w:jc w:val="both"/>
-      </w:pPr>
-      <w:r>
-        <w:rPr>
-          <w:rFonts w:cs="Times New Roman"/>
-        </w:rPr>
-        <w:t xml:space="preserve">klg-agent is a statically linked C program that drives one kernel routine at a time. In sweep mode it writes N to /proc/thread-self/fail-nth, runs the routine (writing to the module's debugfs trigger file or loading the module with finit_module()), reads fail-nth back to learn whether the fault fired, and records the kernel log lines of the attempt. In repeat mode it injects a chosen fault several times and, when given the expected stack frame, verifies that the fault landed there and probes neighbouring N </w:t>
-      </w:r>
-      <w:r>
-        <w:rPr>
-          <w:rFonts w:cs="Times New Roman"/>
-        </w:rPr>
-        <w:t xml:space="preserve">if fault numbering drifted between boots. A random mode enables probabilistic faults for the task only around the target system call, for the random baseline. With --filter the agent sets the fault-injection stack-trace filter (require-start / require-end) to the target module's code, so only the module's own fault points are counted; the module's layout comes from klg_modwatch, a helper kernel module that uses a module notifier to log every module's load address and function symbols. The same log lets the </w:t>
-      </w:r>
-      <w:r>
-        <w:rPr>
-          <w:rFonts w:cs="Times New Roman"/>
-        </w:rPr>
-        <w:t>host resolve kmemleak backtraces of modules that were already unloaded. Before each attempt the agent writes a marker to the host, so that if the guest kernel crashes or hangs, the host records the faulting fault point, reboots the VM and resumes.</w:t>
-      </w:r>
-    </w:p>
-    <w:p>
-      <w:pPr>
-        <w:pStyle w:val="Heading3"/>
-      </w:pPr>
-      <w:r>
-        <w:t>3.2.4 Verifier, evaluation and dashboard (Python) - Aarav Jain</w:t>
-      </w:r>
-    </w:p>
-    <w:p>
-      <w:pPr>
-        <w:jc w:val="both"/>
-      </w:pPr>
-      <w:r>
-        <w:rPr>
-          <w:rFonts w:cs="Times New Roman"/>
-        </w:rPr>
-        <w:t>The klg package builds modules and IR, runs the analyser, generates the guest job scripts, boots the VM, symbolises stack frames with the kernel's faddr2line script, plans the confirmation tests, schedules them in kmemleak rounds so that leaks can be attributed unambiguously, and computes verdicts and metrics. The Streamlit dashboard lists findings with verdicts, highlights the allocation, failing call and leaking exit in the source, shows the kmemleak backtraces, compares approaches and can run the pipelin</w:t>
-      </w:r>
-      <w:r>
-        <w:rPr>
-          <w:rFonts w:cs="Times New Roman"/>
-        </w:rPr>
-        <w:t>e.</w:t>
-      </w:r>
-    </w:p>
-    <w:p>
-      <w:pPr>
-        <w:pStyle w:val="Heading3"/>
-      </w:pPr>
-      <w:r>
-        <w:lastRenderedPageBreak/>
         <w:t>3.2.5 Operating-system concepts used</w:t>
       </w:r>
     </w:p>
@@ -5436,7 +5501,7 @@
       <w:pPr>
         <w:pStyle w:val="Heading2"/>
       </w:pPr>
-      <w:bookmarkStart w:id="15" w:name="_Toc243002877"/>
+      <w:bookmarkStart w:id="15" w:name="_Toc243006977"/>
       <w:r>
         <w:t>3.3 Algorithms Used</w:t>
       </w:r>
@@ -5832,6 +5897,7 @@
           <w:rFonts w:ascii="Consolas" w:eastAsia="Consolas" w:hAnsi="Consolas" w:cs="Consolas"/>
           <w:sz w:val="16"/>
         </w:rPr>
+        <w:lastRenderedPageBreak/>
         <w:t>input : candidate C (alloc line, trigger lines, function), module M</w:t>
       </w:r>
     </w:p>
@@ -5902,7 +5968,6 @@
           <w:rFonts w:ascii="Consolas" w:eastAsia="Consolas" w:hAnsi="Consolas" w:cs="Consolas"/>
           <w:sz w:val="16"/>
         </w:rPr>
-        <w:lastRenderedPageBreak/>
         <w:t>Plan:</w:t>
       </w:r>
     </w:p>
@@ -6083,7 +6148,7 @@
       <w:pPr>
         <w:pStyle w:val="Heading2"/>
       </w:pPr>
-      <w:bookmarkStart w:id="16" w:name="_Toc243002878"/>
+      <w:bookmarkStart w:id="16" w:name="_Toc243006978"/>
       <w:r>
         <w:t>3.4 Dataset Details</w:t>
       </w:r>
@@ -7618,6 +7683,7 @@
                 <w:rFonts w:cs="Times New Roman"/>
                 <w:sz w:val="17"/>
               </w:rPr>
+              <w:lastRenderedPageBreak/>
               <w:t>s03_list_owner</w:t>
             </w:r>
           </w:p>
@@ -7910,7 +7976,6 @@
                 <w:rFonts w:cs="Times New Roman"/>
                 <w:sz w:val="17"/>
               </w:rPr>
-              <w:lastRenderedPageBreak/>
               <w:t>s07_free_wrapper_ok</w:t>
             </w:r>
           </w:p>
@@ -8991,7 +9056,7 @@
       <w:pPr>
         <w:pStyle w:val="Heading2"/>
       </w:pPr>
-      <w:bookmarkStart w:id="17" w:name="_Toc243002879"/>
+      <w:bookmarkStart w:id="17" w:name="_Toc243006979"/>
       <w:r>
         <w:t>3.5 Tools and Technologies</w:t>
       </w:r>
@@ -9573,6 +9638,7 @@
                 <w:rFonts w:cs="Times New Roman"/>
                 <w:sz w:val="20"/>
               </w:rPr>
+              <w:lastRenderedPageBreak/>
               <w:t>Aarav Jain</w:t>
             </w:r>
           </w:p>
@@ -9624,7 +9690,7 @@
         <w:pageBreakBefore/>
         <w:jc w:val="center"/>
       </w:pPr>
-      <w:bookmarkStart w:id="18" w:name="_Toc243002880"/>
+      <w:bookmarkStart w:id="18" w:name="_Toc243006980"/>
       <w:r>
         <w:lastRenderedPageBreak/>
         <w:t>CHAPTER 4: RESULTS AND DISCUSSION</w:t>
@@ -9635,7 +9701,7 @@
       <w:pPr>
         <w:pStyle w:val="Heading2"/>
       </w:pPr>
-      <w:bookmarkStart w:id="19" w:name="_Toc243002881"/>
+      <w:bookmarkStart w:id="19" w:name="_Toc243006981"/>
       <w:r>
         <w:t>4.1 Experimental Setup</w:t>
       </w:r>
@@ -9970,7 +10036,7 @@
       <w:pPr>
         <w:pStyle w:val="Heading2"/>
       </w:pPr>
-      <w:bookmarkStart w:id="20" w:name="_Toc243002882"/>
+      <w:bookmarkStart w:id="20" w:name="_Toc243006982"/>
       <w:r>
         <w:t>4.2 Results</w:t>
       </w:r>
@@ -11040,7 +11106,7 @@
         </w:rPr>
         <w:lastRenderedPageBreak/>
         <w:drawing>
-          <wp:inline distT="0" distB="0" distL="0" distR="0" wp14:anchorId="6A712092" wp14:editId="10FB82E5">
+          <wp:inline distT="0" distB="0" distL="0" distR="0" wp14:anchorId="1AD813E7" wp14:editId="6E804E92">
             <wp:extent cx="5580000" cy="2349474"/>
             <wp:effectExtent l="0" t="0" r="0" b="0"/>
             <wp:docPr id="10" name="Picture 10"/>
@@ -11103,7 +11169,7 @@
         <w:rPr>
           <w:rFonts w:cs="Times New Roman"/>
         </w:rPr>
-        <w:t xml:space="preserve"> backed by a reproduction. The mapping sweep additionally exposed klg_l10_vmalloc:22, klg_l16_nested_owner:32, which the static analysis misses by design (Section 4.5), so the complete tool finds 16 leaks. cppcheck, a widely used C static analyser given a model of kmalloc/kfree, finds 6 with 1 false alarm(s): kernel-specific patterns such as error codes from other calls, copy_from_user failures, wrappers and slab caches are outside its model.</w:t>
+        <w:t xml:space="preserve"> backed by a reproduction. The mapping sweep additionally exposed klg_l10_vmalloc:22, klg_l16_nested_owner:32, which the static analysis misses by design (Section 4.6), so the complete tool finds 16 leaks. cppcheck, a widely used C static analyser given a model of kmalloc/kfree, finds 6 with 1 false alarm(s): kernel-specific patterns such as error codes from other calls, copy_from_user failures, wrappers and slab caches are outside its model.</w:t>
       </w:r>
     </w:p>
     <w:p>
@@ -11116,7 +11182,7 @@
           <w:noProof/>
         </w:rPr>
         <w:drawing>
-          <wp:inline distT="0" distB="0" distL="0" distR="0" wp14:anchorId="1BD9365A" wp14:editId="7706E625">
+          <wp:inline distT="0" distB="0" distL="0" distR="0" wp14:anchorId="4B532615" wp14:editId="4FE8D4F6">
             <wp:extent cx="4320000" cy="2392615"/>
             <wp:effectExtent l="0" t="0" r="0" b="0"/>
             <wp:docPr id="11" name="Picture 11"/>
@@ -11195,7 +11261,7 @@
           <w:noProof/>
         </w:rPr>
         <w:drawing>
-          <wp:inline distT="0" distB="0" distL="0" distR="0" wp14:anchorId="5EB81645" wp14:editId="573B4695">
+          <wp:inline distT="0" distB="0" distL="0" distR="0" wp14:anchorId="323EB956" wp14:editId="2B58D529">
             <wp:extent cx="5400000" cy="2565000"/>
             <wp:effectExtent l="0" t="0" r="0" b="0"/>
             <wp:docPr id="12" name="Picture 12"/>
@@ -11254,7 +11320,7 @@
           <w:noProof/>
         </w:rPr>
         <w:drawing>
-          <wp:inline distT="0" distB="0" distL="0" distR="0" wp14:anchorId="180FA317" wp14:editId="2AF05E7B">
+          <wp:inline distT="0" distB="0" distL="0" distR="0" wp14:anchorId="09F65339" wp14:editId="49E37691">
             <wp:extent cx="5400000" cy="2565000"/>
             <wp:effectExtent l="0" t="0" r="0" b="0"/>
             <wp:docPr id="13" name="Picture 13"/>
@@ -12333,7 +12399,7 @@
                 <w:rFonts w:cs="Times New Roman"/>
                 <w:sz w:val="20"/>
               </w:rPr>
-              <w:t>27</w:t>
+              <w:t>13</w:t>
             </w:r>
           </w:p>
         </w:tc>
@@ -16875,7 +16941,7 @@
         <w:rPr>
           <w:rFonts w:cs="Times New Roman"/>
         </w:rPr>
-        <w:t>29 of 32 system test cases pass. The failing cases are the known limitations discussed in Section 4.5: l10_vmalloc (not-reproduced); l15_ida (inconclusive); l16_nested_owner (not reported).</w:t>
+        <w:t>29 of 32 system test cases pass. The failing cases are the known limitations discussed in Section 4.6: l10_vmalloc (not-reproduced); l15_ida (inconclusive); l16_nested_owner (not reported).</w:t>
       </w:r>
     </w:p>
     <w:p>
@@ -20210,7 +20276,7 @@
       <w:pPr>
         <w:pStyle w:val="Heading2"/>
       </w:pPr>
-      <w:bookmarkStart w:id="21" w:name="_Toc243002883"/>
+      <w:bookmarkStart w:id="21" w:name="_Toc243006983"/>
       <w:r>
         <w:lastRenderedPageBreak/>
         <w:t>4.3 Performance Metrics</w:t>
@@ -20227,7 +20293,7 @@
           <w:noProof/>
         </w:rPr>
         <w:drawing>
-          <wp:inline distT="0" distB="0" distL="0" distR="0" wp14:anchorId="62656634" wp14:editId="670ECAB4">
+          <wp:inline distT="0" distB="0" distL="0" distR="0" wp14:anchorId="36486FBE" wp14:editId="13F3A86A">
             <wp:extent cx="4320000" cy="2259692"/>
             <wp:effectExtent l="0" t="0" r="0" b="0"/>
             <wp:docPr id="14" name="Picture 14"/>
@@ -20417,7 +20483,7 @@
                 <w:rFonts w:cs="Times New Roman"/>
                 <w:sz w:val="20"/>
               </w:rPr>
-              <w:t>27 ms (0.8 ms per module)</w:t>
+              <w:t>13 ms (0.4 ms per module)</w:t>
             </w:r>
           </w:p>
         </w:tc>
@@ -21126,7 +21192,7 @@
       <w:pPr>
         <w:pStyle w:val="Heading2"/>
       </w:pPr>
-      <w:bookmarkStart w:id="22" w:name="_Toc243002884"/>
+      <w:bookmarkStart w:id="22" w:name="_Toc243006984"/>
       <w:r>
         <w:lastRenderedPageBreak/>
         <w:t>4.4 Evaluation on Real Kernel Code</w:t>
@@ -21147,7 +21213,24 @@
         <w:rPr>
           <w:rFonts w:cs="Times New Roman"/>
         </w:rPr>
-        <w:t xml:space="preserve"> functions with 590 allocation sites and reported 115 warnings in 1.1 s.</w:t>
+        <w:t xml:space="preserve"> functions with 590 allocation sites and reported 64 warnings in 1.2 s.</w:t>
+      </w:r>
+    </w:p>
+    <w:p>
+      <w:pPr>
+        <w:jc w:val="both"/>
+      </w:pPr>
+      <w:r>
+        <w:rPr>
+          <w:rFonts w:cs="Times New Roman"/>
+        </w:rPr>
+        <w:t>A first run on real code exposed a dominant false-positive pattern absent from the benchmark: kernel lookup and factory helpers return an ERR_PTR error code (checked with IS_ERR()) instead of NULL on failure, and the analyser flagged the error-return path as a leak even though the pointer there is an error code, not memory. Modelling IS_ERR() like the NULL check (an ERR_PTR on the error branch is nothing to free) cut the real-code warnings from 115 to 64 without changing any benchmark result. The figures be</w:t>
+      </w:r>
+      <w:r>
+        <w:rPr>
+          <w:rFonts w:cs="Times New Roman"/>
+        </w:rPr>
+        <w:t>low are after this change; the remaining warnings are discussed next.</w:t>
       </w:r>
     </w:p>
     <w:p>
@@ -21403,7 +21486,7 @@
                 <w:rFonts w:cs="Times New Roman"/>
                 <w:sz w:val="17"/>
               </w:rPr>
-              <w:t>8</w:t>
+              <w:t>2</w:t>
             </w:r>
           </w:p>
         </w:tc>
@@ -21437,7 +21520,7 @@
                 <w:rFonts w:cs="Times New Roman"/>
                 <w:sz w:val="17"/>
               </w:rPr>
-              <w:t>8 inconclusive</w:t>
+              <w:t>2 inconclusive</w:t>
             </w:r>
           </w:p>
         </w:tc>
@@ -21527,7 +21610,7 @@
                 <w:rFonts w:cs="Times New Roman"/>
                 <w:sz w:val="17"/>
               </w:rPr>
-              <w:t>1</w:t>
+              <w:t>0</w:t>
             </w:r>
           </w:p>
         </w:tc>
@@ -21561,7 +21644,7 @@
                 <w:rFonts w:cs="Times New Roman"/>
                 <w:sz w:val="17"/>
               </w:rPr>
-              <w:t>1 not-reproduced</w:t>
+              <w:t>—</w:t>
             </w:r>
           </w:p>
         </w:tc>
@@ -21775,7 +21858,7 @@
                 <w:rFonts w:cs="Times New Roman"/>
                 <w:sz w:val="17"/>
               </w:rPr>
-              <w:t>6</w:t>
+              <w:t>3</w:t>
             </w:r>
           </w:p>
         </w:tc>
@@ -21809,7 +21892,7 @@
                 <w:rFonts w:cs="Times New Roman"/>
                 <w:sz w:val="17"/>
               </w:rPr>
-              <w:t>6 inconclusive</w:t>
+              <w:t>3 inconclusive</w:t>
             </w:r>
           </w:p>
         </w:tc>
@@ -21899,7 +21982,7 @@
                 <w:rFonts w:cs="Times New Roman"/>
                 <w:sz w:val="17"/>
               </w:rPr>
-              <w:t>18</w:t>
+              <w:t>6</w:t>
             </w:r>
           </w:p>
         </w:tc>
@@ -21933,7 +22016,7 @@
                 <w:rFonts w:cs="Times New Roman"/>
                 <w:sz w:val="17"/>
               </w:rPr>
-              <w:t>18 inconclusive</w:t>
+              <w:t>6 inconclusive</w:t>
             </w:r>
           </w:p>
         </w:tc>
@@ -22288,7 +22371,7 @@
                 <w:rFonts w:cs="Times New Roman"/>
                 <w:sz w:val="17"/>
               </w:rPr>
-              <w:t>754</w:t>
+              <w:t>750</w:t>
             </w:r>
           </w:p>
         </w:tc>
@@ -22395,7 +22478,7 @@
                 <w:rFonts w:cs="Times New Roman"/>
                 <w:sz w:val="17"/>
               </w:rPr>
-              <w:t>10</w:t>
+              <w:t>9</w:t>
             </w:r>
           </w:p>
         </w:tc>
@@ -22412,7 +22495,7 @@
                 <w:rFonts w:cs="Times New Roman"/>
                 <w:sz w:val="17"/>
               </w:rPr>
-              <w:t>7</w:t>
+              <w:t>21</w:t>
             </w:r>
           </w:p>
         </w:tc>
@@ -22429,7 +22512,7 @@
                 <w:rFonts w:cs="Times New Roman"/>
                 <w:sz w:val="17"/>
               </w:rPr>
-              <w:t>10 inconclusive</w:t>
+              <w:t>9 inconclusive</w:t>
             </w:r>
           </w:p>
         </w:tc>
@@ -22716,6 +22799,7 @@
                 <w:rFonts w:cs="Times New Roman"/>
                 <w:sz w:val="17"/>
               </w:rPr>
+              <w:lastRenderedPageBreak/>
               <w:t>tun</w:t>
             </w:r>
           </w:p>
@@ -22767,7 +22851,7 @@
                 <w:rFonts w:cs="Times New Roman"/>
                 <w:sz w:val="17"/>
               </w:rPr>
-              <w:t>1</w:t>
+              <w:t>0</w:t>
             </w:r>
           </w:p>
         </w:tc>
@@ -22801,7 +22885,7 @@
                 <w:rFonts w:cs="Times New Roman"/>
                 <w:sz w:val="17"/>
               </w:rPr>
-              <w:t>1 inconclusive</w:t>
+              <w:t>—</w:t>
             </w:r>
           </w:p>
         </w:tc>
@@ -22891,7 +22975,7 @@
                 <w:rFonts w:cs="Times New Roman"/>
                 <w:sz w:val="17"/>
               </w:rPr>
-              <w:t>2</w:t>
+              <w:t>0</w:t>
             </w:r>
           </w:p>
         </w:tc>
@@ -22925,7 +23009,7 @@
                 <w:rFonts w:cs="Times New Roman"/>
                 <w:sz w:val="17"/>
               </w:rPr>
-              <w:t>2 inconclusive</w:t>
+              <w:t>—</w:t>
             </w:r>
           </w:p>
         </w:tc>
@@ -23015,7 +23099,7 @@
                 <w:rFonts w:cs="Times New Roman"/>
                 <w:sz w:val="17"/>
               </w:rPr>
-              <w:t>4</w:t>
+              <w:t>2</w:t>
             </w:r>
           </w:p>
         </w:tc>
@@ -23049,7 +23133,7 @@
                 <w:rFonts w:cs="Times New Roman"/>
                 <w:sz w:val="17"/>
               </w:rPr>
-              <w:t>4 inconclusive</w:t>
+              <w:t>2 inconclusive</w:t>
             </w:r>
           </w:p>
         </w:tc>
@@ -23139,7 +23223,7 @@
                 <w:rFonts w:cs="Times New Roman"/>
                 <w:sz w:val="17"/>
               </w:rPr>
-              <w:t>1</w:t>
+              <w:t>0</w:t>
             </w:r>
           </w:p>
         </w:tc>
@@ -23173,7 +23257,7 @@
                 <w:rFonts w:cs="Times New Roman"/>
                 <w:sz w:val="17"/>
               </w:rPr>
-              <w:t>1 inconclusive</w:t>
+              <w:t>—</w:t>
             </w:r>
           </w:p>
         </w:tc>
@@ -23216,14 +23300,7 @@
         <w:rPr>
           <w:rFonts w:cs="Times New Roman"/>
         </w:rPr>
-        <w:t xml:space="preserve"> Of the 59 warnings in these modules, 13 are false positive, 38 are likely false positive, 8 are not reviewed. All 13 warnings read in the kernel source (every high-confidence one) are false positives. The causes are the analyser's known blind spots: functions that return an ERR_PTR or a reference-counted object (the IS_ERR path holds nothing to free), error </w:t>
-      </w:r>
-      <w:r>
-        <w:rPr>
-          <w:rFonts w:cs="Times New Roman"/>
-        </w:rPr>
-        <w:lastRenderedPageBreak/>
-        <w:t>codes kept in a variable that later selects the cleanup (for example err &lt; 0 at a shared unlock label in snd_aloop), and objects handed to a list insid</w:t>
+        <w:t xml:space="preserve"> Of the 30 warnings in these modules, 12 are false positive, 10 are likely false positive, 8 are not reviewed. All 12 warnings read in the kernel source (every high-confidence one) are false positives. The causes are the analyser's known blind spots: functions that return an ERR_PTR or a reference-counted object (the IS_ERR path holds nothing to free), error codes kept in a variable that later selects the cleanup (for example err &lt; 0 at a shared unlock label in snd_aloop), and objects handed to a list insid</w:t>
       </w:r>
       <w:r>
         <w:rPr>
@@ -23247,7 +23324,7 @@
         <w:rPr>
           <w:rFonts w:cs="Times New Roman"/>
         </w:rPr>
-        <w:t xml:space="preserve"> Of the 59 warnings, 58 were inconclusive, 1 were not-reproduced. 50 inconclusive verdicts mean that no fault point of module initialisation reaches the warning's failing call: the code runs only on other entry points (file system mount, ioctl, netlink, block I/O), which the runtime stage does not drive yet. Driving those entry points (for example with mount images or syzkaller-style system call programs) is the main extension needed for real code.</w:t>
+        <w:t xml:space="preserve"> Of the 30 warnings, 30 were inconclusive. 22 inconclusive verdicts mean that no fault point of module initialisation reaches the warning's failing call: the code runs only on other entry points (file system mount, ioctl, netlink, block I/O), which the runtime stage does not drive yet. Driving those entry points (for example with mount images or syzkaller-style system call programs) is the main extension needed for real code.</w:t>
       </w:r>
     </w:p>
     <w:p>
@@ -23265,7 +23342,7 @@
         <w:rPr>
           <w:rFonts w:cs="Times New Roman"/>
         </w:rPr>
-        <w:t xml:space="preserve"> Exercising 6156 fault points of module initialisation left 1 unreferenced allocation site(s): erofs zdata.c:466 (21 objects).</w:t>
+        <w:t xml:space="preserve"> Exercising 6166 fault points of module initialisation left 1 unreferenced allocation site(s): erofs zdata.c:466 (15 objects).</w:t>
       </w:r>
     </w:p>
     <w:p>
@@ -23300,7 +23377,14 @@
         <w:rPr>
           <w:rFonts w:cs="Times New Roman"/>
         </w:rPr>
-        <w:t xml:space="preserve"> The sweep crashed the guest kernel 10 time(s) while loading null_blk. For null_blk, failing an allocation at certain points of its initialisation leads to a page fault in bdev_release(): a block-device file opened during the failed initialisation is released on return to user space after the module has already been freed, and the release reads the module's block_device_operations from freed module memory. The crash is reproducible at consecutive fault points and the crash-recovery mechanism resumed the swe</w:t>
+        <w:t xml:space="preserve"> The sweep crashed the guest kernel 10 time(s) while loading null_blk. For null_blk, failing an allocation at certain points of its initialisation leads to a page fault in bdev_release(): a block-device file opened during the failed initialisation is released on return to user space after the module has already been freed, and the release reads the module's </w:t>
+      </w:r>
+      <w:r>
+        <w:rPr>
+          <w:rFonts w:cs="Times New Roman"/>
+        </w:rPr>
+        <w:lastRenderedPageBreak/>
+        <w:t>block_device_operations from freed module memory. The crash is reproducible at consecutive fault points and the crash-recovery mechanism resumed the swe</w:t>
       </w:r>
       <w:r>
         <w:rPr>
@@ -23348,7 +23432,6 @@
           <w:rFonts w:ascii="Consolas" w:eastAsia="Consolas" w:hAnsi="Consolas" w:cs="Consolas"/>
           <w:sz w:val="16"/>
         </w:rPr>
-        <w:lastRenderedPageBreak/>
         <w:t>RIP: 0010:bdev_release+0x129/0x170</w:t>
       </w:r>
     </w:p>
@@ -23445,35 +23528,341 @@
       <w:pPr>
         <w:pStyle w:val="Heading2"/>
       </w:pPr>
-      <w:bookmarkStart w:id="23" w:name="_Toc243002885"/>
-      <w:r>
-        <w:t>4.5 Analysis</w:t>
+      <w:bookmarkStart w:id="23" w:name="_Toc243006985"/>
+      <w:r>
+        <w:t>4.5 Seeded Leaks in Real Kernel Code</w:t>
       </w:r>
       <w:bookmarkEnd w:id="23"/>
     </w:p>
     <w:p>
       <w:pPr>
         <w:jc w:val="both"/>
+      </w:pPr>
+      <w:r>
+        <w:rPr>
+          <w:rFonts w:cs="Times New Roman"/>
+        </w:rPr>
+        <w:t xml:space="preserve">The modules above show that the static analyser is less precise on real code and that its warnings there mostly sit on paths the init-time runtime stage does not reach. To evaluate the complete detect-confirm-fix loop on real kernel code directly, we use the standard method of bug seeding: a known release is removed from a real kernel source file, exactly as a careless patch would, and the module is built and run unchanged apart from that one line. The original module has no such leak; the bug is ours, and </w:t>
+      </w:r>
+      <w:r>
+        <w:rPr>
+          <w:rFonts w:cs="Times New Roman"/>
+        </w:rPr>
+        <w:t>clearly marked. This isolates whether the whole pipeline catches, reproduces and fixes a genuine early-exit leak in real driver code.</w:t>
+      </w:r>
+    </w:p>
+    <w:p>
+      <w:pPr>
+        <w:keepNext/>
+        <w:jc w:val="center"/>
       </w:pPr>
       <w:r>
         <w:rPr>
           <w:rFonts w:cs="Times New Roman"/>
           <w:b/>
-        </w:rPr>
-        <w:t>Static versus hybrid.</w:t>
-      </w:r>
+          <w:sz w:val="22"/>
+        </w:rPr>
+        <w:t>Table 4.10: Seeded early-exit leaks in real kernel modules</w:t>
+      </w:r>
+    </w:p>
+    <w:tbl>
+      <w:tblPr>
+        <w:tblStyle w:val="TableGrid"/>
+        <w:tblW w:w="0" w:type="auto"/>
+        <w:jc w:val="center"/>
+        <w:tblLook w:val="04A0" w:firstRow="1" w:lastRow="0" w:firstColumn="1" w:lastColumn="0" w:noHBand="0" w:noVBand="1"/>
+      </w:tblPr>
+      <w:tblGrid>
+        <w:gridCol w:w="1304"/>
+        <w:gridCol w:w="1474"/>
+        <w:gridCol w:w="2381"/>
+        <w:gridCol w:w="907"/>
+        <w:gridCol w:w="1134"/>
+        <w:gridCol w:w="737"/>
+      </w:tblGrid>
+      <w:tr>
+        <w:trPr>
+          <w:jc w:val="center"/>
+        </w:trPr>
+        <w:tc>
+          <w:tcPr>
+            <w:tcW w:w="1304" w:type="dxa"/>
+            <w:shd w:val="clear" w:color="auto" w:fill="E7E6E1"/>
+          </w:tcPr>
+          <w:p>
+            <w:pPr>
+              <w:spacing w:after="40" w:line="240" w:lineRule="auto"/>
+            </w:pPr>
+            <w:r>
+              <w:rPr>
+                <w:rFonts w:cs="Times New Roman"/>
+                <w:b/>
+                <w:sz w:val="17"/>
+              </w:rPr>
+              <w:t>Module</w:t>
+            </w:r>
+          </w:p>
+        </w:tc>
+        <w:tc>
+          <w:tcPr>
+            <w:tcW w:w="1474" w:type="dxa"/>
+            <w:shd w:val="clear" w:color="auto" w:fill="E7E6E1"/>
+          </w:tcPr>
+          <w:p>
+            <w:pPr>
+              <w:spacing w:after="40" w:line="240" w:lineRule="auto"/>
+            </w:pPr>
+            <w:r>
+              <w:rPr>
+                <w:rFonts w:cs="Times New Roman"/>
+                <w:b/>
+                <w:sz w:val="17"/>
+              </w:rPr>
+              <w:t>Removed at</w:t>
+            </w:r>
+          </w:p>
+        </w:tc>
+        <w:tc>
+          <w:tcPr>
+            <w:tcW w:w="2381" w:type="dxa"/>
+            <w:shd w:val="clear" w:color="auto" w:fill="E7E6E1"/>
+          </w:tcPr>
+          <w:p>
+            <w:pPr>
+              <w:spacing w:after="40" w:line="240" w:lineRule="auto"/>
+            </w:pPr>
+            <w:r>
+              <w:rPr>
+                <w:rFonts w:cs="Times New Roman"/>
+                <w:b/>
+                <w:sz w:val="17"/>
+              </w:rPr>
+              <w:t>Removed statement</w:t>
+            </w:r>
+          </w:p>
+        </w:tc>
+        <w:tc>
+          <w:tcPr>
+            <w:tcW w:w="907" w:type="dxa"/>
+            <w:shd w:val="clear" w:color="auto" w:fill="E7E6E1"/>
+          </w:tcPr>
+          <w:p>
+            <w:pPr>
+              <w:spacing w:after="40" w:line="240" w:lineRule="auto"/>
+            </w:pPr>
+            <w:r>
+              <w:rPr>
+                <w:rFonts w:cs="Times New Roman"/>
+                <w:b/>
+                <w:sz w:val="17"/>
+              </w:rPr>
+              <w:t>Detected</w:t>
+            </w:r>
+          </w:p>
+        </w:tc>
+        <w:tc>
+          <w:tcPr>
+            <w:tcW w:w="1134" w:type="dxa"/>
+            <w:shd w:val="clear" w:color="auto" w:fill="E7E6E1"/>
+          </w:tcPr>
+          <w:p>
+            <w:pPr>
+              <w:spacing w:after="40" w:line="240" w:lineRule="auto"/>
+            </w:pPr>
+            <w:r>
+              <w:rPr>
+                <w:rFonts w:cs="Times New Roman"/>
+                <w:b/>
+                <w:sz w:val="17"/>
+              </w:rPr>
+              <w:t>Confirmed (VM)</w:t>
+            </w:r>
+          </w:p>
+        </w:tc>
+        <w:tc>
+          <w:tcPr>
+            <w:tcW w:w="737" w:type="dxa"/>
+            <w:shd w:val="clear" w:color="auto" w:fill="E7E6E1"/>
+          </w:tcPr>
+          <w:p>
+            <w:pPr>
+              <w:spacing w:after="40" w:line="240" w:lineRule="auto"/>
+            </w:pPr>
+            <w:r>
+              <w:rPr>
+                <w:rFonts w:cs="Times New Roman"/>
+                <w:b/>
+                <w:sz w:val="17"/>
+              </w:rPr>
+              <w:t>Fixed</w:t>
+            </w:r>
+          </w:p>
+        </w:tc>
+      </w:tr>
+      <w:tr>
+        <w:trPr>
+          <w:jc w:val="center"/>
+        </w:trPr>
+        <w:tc>
+          <w:tcPr>
+            <w:tcW w:w="1304" w:type="dxa"/>
+          </w:tcPr>
+          <w:p>
+            <w:pPr>
+              <w:spacing w:after="40" w:line="240" w:lineRule="auto"/>
+            </w:pPr>
+            <w:r>
+              <w:rPr>
+                <w:rFonts w:cs="Times New Roman"/>
+                <w:sz w:val="17"/>
+              </w:rPr>
+              <w:t>brd</w:t>
+            </w:r>
+          </w:p>
+        </w:tc>
+        <w:tc>
+          <w:tcPr>
+            <w:tcW w:w="1474" w:type="dxa"/>
+          </w:tcPr>
+          <w:p>
+            <w:pPr>
+              <w:spacing w:after="40" w:line="240" w:lineRule="auto"/>
+            </w:pPr>
+            <w:r>
+              <w:rPr>
+                <w:rFonts w:cs="Times New Roman"/>
+                <w:sz w:val="17"/>
+              </w:rPr>
+              <w:t>brd.c:350</w:t>
+            </w:r>
+          </w:p>
+        </w:tc>
+        <w:tc>
+          <w:tcPr>
+            <w:tcW w:w="2381" w:type="dxa"/>
+          </w:tcPr>
+          <w:p>
+            <w:pPr>
+              <w:spacing w:after="40" w:line="240" w:lineRule="auto"/>
+            </w:pPr>
+            <w:r>
+              <w:rPr>
+                <w:rFonts w:cs="Times New Roman"/>
+                <w:sz w:val="17"/>
+              </w:rPr>
+              <w:t>brd_free_device(brd);</w:t>
+            </w:r>
+          </w:p>
+        </w:tc>
+        <w:tc>
+          <w:tcPr>
+            <w:tcW w:w="907" w:type="dxa"/>
+          </w:tcPr>
+          <w:p>
+            <w:pPr>
+              <w:spacing w:after="40" w:line="240" w:lineRule="auto"/>
+            </w:pPr>
+            <w:r>
+              <w:rPr>
+                <w:rFonts w:cs="Times New Roman"/>
+                <w:sz w:val="17"/>
+              </w:rPr>
+              <w:t>yes</w:t>
+            </w:r>
+          </w:p>
+        </w:tc>
+        <w:tc>
+          <w:tcPr>
+            <w:tcW w:w="1134" w:type="dxa"/>
+          </w:tcPr>
+          <w:p>
+            <w:pPr>
+              <w:spacing w:after="40" w:line="240" w:lineRule="auto"/>
+            </w:pPr>
+            <w:r>
+              <w:rPr>
+                <w:rFonts w:cs="Times New Roman"/>
+                <w:sz w:val="17"/>
+              </w:rPr>
+              <w:t>no</w:t>
+            </w:r>
+          </w:p>
+        </w:tc>
+        <w:tc>
+          <w:tcPr>
+            <w:tcW w:w="737" w:type="dxa"/>
+          </w:tcPr>
+          <w:p>
+            <w:pPr>
+              <w:spacing w:after="40" w:line="240" w:lineRule="auto"/>
+            </w:pPr>
+            <w:r>
+              <w:rPr>
+                <w:rFonts w:cs="Times New Roman"/>
+                <w:sz w:val="17"/>
+              </w:rPr>
+              <w:t>yes</w:t>
+            </w:r>
+          </w:p>
+        </w:tc>
+      </w:tr>
+    </w:tbl>
+    <w:p>
+      <w:pPr>
+        <w:spacing w:after="80"/>
+      </w:pPr>
+    </w:p>
+    <w:p>
+      <w:pPr>
+        <w:jc w:val="both"/>
+      </w:pPr>
       <w:r>
         <w:rPr>
           <w:rFonts w:cs="Times New Roman"/>
         </w:rPr>
-        <w:t xml:space="preserve"> Runtime verification removed all static false positives (1 in this run) and attached reproduction steps and kmemleak backtraces to every confirmed report. The cost is a modest loss of recall: warnings whose failure cannot be injected stay inconclusive rather than confirmed. In the corpus this happens for klg_l15, where ida_alloc() never allocates for small identifiers (they are stored inline in the XArray), so its failure cannot be provoked; reporting it as inconclusive is the honest outcome, and the warni</w:t>
+        <w:t xml:space="preserve">For example, in drivers/block/brd.c the call </w:t>
+      </w:r>
+      <w:r>
+        <w:rPr>
+          <w:rFonts w:ascii="Consolas" w:eastAsia="Consolas" w:hAnsi="Consolas" w:cs="Consolas"/>
+          <w:sz w:val="22"/>
+        </w:rPr>
+        <w:t>brd_free_device(brd);</w:t>
       </w:r>
       <w:r>
         <w:rPr>
           <w:rFonts w:cs="Times New Roman"/>
         </w:rPr>
-        <w:t>ng is still shown to the developer.</w:t>
-      </w:r>
+        <w:t xml:space="preserve"> releases the brd_device obtained earlier in brd_alloc() when disk allocation fails. Removing that call leaks the brd_device (and its xarray) when disk allocation fails during module initialisation. brd_init() calls brd_alloc() in a loop at module load, so failing blk_alloc_disk()/add_disk() with fail-nth reproduces the leak.</w:t>
+      </w:r>
+    </w:p>
+    <w:p>
+      <w:pPr>
+        <w:jc w:val="both"/>
+      </w:pPr>
+      <w:r>
+        <w:rPr>
+          <w:rFonts w:cs="Times New Roman"/>
+        </w:rPr>
+        <w:t xml:space="preserve">All seeded leaks were detected statically and the re-inserted-release fix was validated. Runtime confirmation of the brd seed was obstructed by a separate defect: failing allocations during brd's initialisation crash the guest kernel (the same fragility seen for null_blk in Section 4.4), </w:t>
+      </w:r>
+      <w:r>
+        <w:rPr>
+          <w:rFonts w:cs="Times New Roman"/>
+        </w:rPr>
+        <w:lastRenderedPageBreak/>
+        <w:t>so a clean kmemleak scan of the leaking path could not always complete. This is itself a finding about block drivers under fault injection.</w:t>
+      </w:r>
+    </w:p>
+    <w:p>
+      <w:pPr>
+        <w:pStyle w:val="Heading2"/>
+      </w:pPr>
+      <w:bookmarkStart w:id="24" w:name="_Toc243006986"/>
+      <w:r>
+        <w:t>4.6 Analysis</w:t>
+      </w:r>
+      <w:bookmarkEnd w:id="24"/>
     </w:p>
     <w:p>
       <w:pPr>
@@ -23484,19 +23873,19 @@
           <w:rFonts w:cs="Times New Roman"/>
           <w:b/>
         </w:rPr>
-        <w:t>Hybrid versus dynamic-only.</w:t>
+        <w:t>Static versus hybrid.</w:t>
       </w:r>
       <w:r>
         <w:rPr>
           <w:rFonts w:cs="Times New Roman"/>
         </w:rPr>
-        <w:t xml:space="preserve"> Exhaustive fault injection runs every routine once per fault point (1261 executions, dominated by module loading, which has hundreds of fault points) and random injection uses a fixed budget. KernelLeakGuard restricts its sweep with the kernel's fault-injection stack-trace filter (require-start/require-end set to the module's code, taken from klg_modwatch's log), so fail-nth counts only fault points reached from the module itself; together with the targeted confirmation it needs 425 executions in total and</w:t>
+        <w:t xml:space="preserve"> Runtime verification removed all static false positives (1 in this run) and attached reproduction steps and kmemleak backtraces to every confirmed report. The cost is a modest loss of recall: warnings whose failure cannot be injected stay inconclusive rather than confirmed. In the corpus this happens for klg_l15, where ida_alloc() never allocates for small identifiers (they are stored inline in the XArray), so its failure cannot be provoked; reporting it as inconclusive is the honest outcome, and the warni</w:t>
       </w:r>
       <w:r>
         <w:rPr>
           <w:rFonts w:cs="Times New Roman"/>
         </w:rPr>
-        <w:t xml:space="preserve"> finds 16 leaks, against 15 for the exhaustive baseline. Leaks in module initialisation code are reported by kmemleak with raw addresses because the module is unloaded after its failed initialisation; klg_modwatch, a helper module that logs each module's load address and symbols, turns them back into exact source lines. Dynamic tools report only a backtrace, whereas KernelLeakGuard's report names the leaking exit, the returned error, the failing call and a validated fix.</w:t>
+        <w:t>ng is still shown to the developer.</w:t>
       </w:r>
     </w:p>
     <w:p>
@@ -23508,6 +23897,30 @@
           <w:rFonts w:cs="Times New Roman"/>
           <w:b/>
         </w:rPr>
+        <w:t>Hybrid versus dynamic-only.</w:t>
+      </w:r>
+      <w:r>
+        <w:rPr>
+          <w:rFonts w:cs="Times New Roman"/>
+        </w:rPr>
+        <w:t xml:space="preserve"> Exhaustive fault injection runs every routine once per fault point (1261 executions, dominated by module loading, which has hundreds of fault points) and random injection uses a fixed budget. KernelLeakGuard restricts its sweep with the kernel's fault-injection stack-trace filter (require-start/require-end set to the module's code, taken from klg_modwatch's log), so fail-nth counts only fault points reached from the module itself; together with the targeted confirmation it needs 425 executions in total and</w:t>
+      </w:r>
+      <w:r>
+        <w:rPr>
+          <w:rFonts w:cs="Times New Roman"/>
+        </w:rPr>
+        <w:t xml:space="preserve"> finds 16 leaks, against 15 for the exhaustive baseline. Leaks in module initialisation code are reported by kmemleak with raw addresses because the module is unloaded after its failed initialisation; klg_modwatch, a helper module that logs each module's load address and symbols, turns them back into exact source lines. Dynamic tools report only a backtrace, whereas KernelLeakGuard's report names the leaking exit, the returned error, the failing call and a validated fix.</w:t>
+      </w:r>
+    </w:p>
+    <w:p>
+      <w:pPr>
+        <w:jc w:val="both"/>
+      </w:pPr>
+      <w:r>
+        <w:rPr>
+          <w:rFonts w:cs="Times New Roman"/>
+          <w:b/>
+        </w:rPr>
         <w:t>Trustworthy kmemleak results.</w:t>
       </w:r>
       <w:r>
@@ -23520,14 +23933,14 @@
         <w:rPr>
           <w:rFonts w:cs="Times New Roman"/>
         </w:rPr>
-        <w:t xml:space="preserve">d stacks from the page allocator, erases kernel stacks on return to user space, disables kmemleak's task-stack scanning (all tested routines have returned before a scan) and boots with init_on_alloc=1 init_on_free=1 so that slab memory is zeroed. This made the klg_l17 verdict stable. vmalloc'd </w:t>
+        <w:t xml:space="preserve">d stacks from the page allocator, erases kernel stacks on return to user space, disables kmemleak's task-stack scanning (all tested routines have returned before a scan) and boots with init_on_alloc=1 init_on_free=1 so that slab memory is zeroed. This made the klg_l17 verdict stable. vmalloc'd memory remains less stable (see the repeated runs in Section 4.3): such leaks can still be hidden </w:t>
       </w:r>
       <w:r>
         <w:rPr>
           <w:rFonts w:cs="Times New Roman"/>
         </w:rPr>
         <w:lastRenderedPageBreak/>
-        <w:t>memory remains less stable (see the repeated runs in Section 4.3): such leaks can still be hidden in an individual scan, which is why a missing confirmation is reported as 'not reproduced', never as 'safe'.</w:t>
+        <w:t>in an individual scan, which is why a missing confirmation is reported as 'not reproduced', never as 'safe'.</w:t>
       </w:r>
     </w:p>
     <w:p>
@@ -23572,22 +23985,22 @@
         <w:pageBreakBefore/>
         <w:jc w:val="center"/>
       </w:pPr>
-      <w:bookmarkStart w:id="24" w:name="_Toc243002886"/>
+      <w:bookmarkStart w:id="25" w:name="_Toc243006987"/>
       <w:r>
         <w:lastRenderedPageBreak/>
         <w:t>CHAPTER 5: CONCLUSION AND FUTURE WORK</w:t>
       </w:r>
-      <w:bookmarkEnd w:id="24"/>
+      <w:bookmarkEnd w:id="25"/>
     </w:p>
     <w:p>
       <w:pPr>
         <w:pStyle w:val="Heading2"/>
       </w:pPr>
-      <w:bookmarkStart w:id="25" w:name="_Toc243002887"/>
+      <w:bookmarkStart w:id="26" w:name="_Toc243006988"/>
       <w:r>
         <w:t>5.1 Conclusion</w:t>
       </w:r>
-      <w:bookmarkEnd w:id="25"/>
+      <w:bookmarkEnd w:id="26"/>
     </w:p>
     <w:p>
       <w:pPr>
@@ -23614,13 +24027,13 @@
         <w:rPr>
           <w:rFonts w:cs="Times New Roman"/>
         </w:rPr>
-        <w:t>On 39 real Linux modules the static analyser reported 115 warnings; the reviewed ones were false positives caused by patterns it does not yet model, and the runtime stage confirmed none of them, so no false report reached the developer. Exercising the initialisation of real modules under fault injection also exposed a reproducible kernel crash in the null_blk load path and a kmemleak report during erofs initialisation, showing that the runtime half is useful beyond confirming static warnings; both still nee</w:t>
+        <w:t>On 39 real Linux modules the static analyser reported 64 warnings; the reviewed ones were false positives caused by patterns it does not yet model, and the runtime stage confirmed none of them, so no false report reached the developer. Exercising the initialisation of real modules under fault injection also exposed a reproducible kernel crash in the null_blk load path and a kmemleak report during erofs initialisation, showing that the runtime half is useful beyond confirming static warnings; both still need</w:t>
       </w:r>
       <w:r>
         <w:rPr>
           <w:rFonts w:cs="Times New Roman"/>
         </w:rPr>
-        <w:t>d root-cause analysis.</w:t>
+        <w:t xml:space="preserve"> root-cause analysis.</w:t>
       </w:r>
     </w:p>
     <w:p>
@@ -23638,11 +24051,11 @@
       <w:pPr>
         <w:pStyle w:val="Heading2"/>
       </w:pPr>
-      <w:bookmarkStart w:id="26" w:name="_Toc243002888"/>
+      <w:bookmarkStart w:id="27" w:name="_Toc243006989"/>
       <w:r>
         <w:t>5.2 Future Work</w:t>
       </w:r>
-      <w:bookmarkEnd w:id="26"/>
+      <w:bookmarkEnd w:id="27"/>
     </w:p>
     <w:p>
       <w:pPr>
@@ -23679,7 +24092,7 @@
         <w:rPr>
           <w:rFonts w:cs="Times New Roman"/>
         </w:rPr>
-        <w:t>Model ERR_PTR returns, reference-counted objects and error codes stored in variables: the causes of the false positives found on real kernel code (Section 4.4).</w:t>
+        <w:t>Model reference-counted lookups (functions returning a put-released object) and error codes stored in variables: the remaining false-positive causes on real kernel code (Section 4.4); the ERR_PTR pattern is already handled.</w:t>
       </w:r>
     </w:p>
     <w:p>
@@ -23692,6 +24105,7 @@
         <w:rPr>
           <w:rFonts w:cs="Times New Roman"/>
         </w:rPr>
+        <w:lastRenderedPageBreak/>
         <w:t>•  </w:t>
       </w:r>
       <w:r>
@@ -23711,7 +24125,6 @@
         <w:rPr>
           <w:rFonts w:cs="Times New Roman"/>
         </w:rPr>
-        <w:lastRenderedPageBreak/>
         <w:t>•  </w:t>
       </w:r>
       <w:r>
@@ -23802,12 +24215,12 @@
         <w:pageBreakBefore/>
         <w:jc w:val="center"/>
       </w:pPr>
-      <w:bookmarkStart w:id="27" w:name="_Toc243002889"/>
+      <w:bookmarkStart w:id="28" w:name="_Toc243006990"/>
       <w:r>
         <w:lastRenderedPageBreak/>
         <w:t>REFERENCES</w:t>
       </w:r>
-      <w:bookmarkEnd w:id="27"/>
+      <w:bookmarkEnd w:id="28"/>
     </w:p>
     <w:p>
       <w:pPr>
@@ -24069,12 +24482,12 @@
         <w:pageBreakBefore/>
         <w:jc w:val="center"/>
       </w:pPr>
-      <w:bookmarkStart w:id="28" w:name="_Toc243002890"/>
+      <w:bookmarkStart w:id="29" w:name="_Toc243006991"/>
       <w:r>
         <w:lastRenderedPageBreak/>
         <w:t>APPENDIX: SOURCE CODE</w:t>
       </w:r>
-      <w:bookmarkEnd w:id="28"/>
+      <w:bookmarkEnd w:id="29"/>
     </w:p>
     <w:p>
       <w:pPr>
@@ -24226,7 +24639,7 @@
                 <w:rFonts w:cs="Times New Roman"/>
                 <w:sz w:val="20"/>
               </w:rPr>
-              <w:t>1561</w:t>
+              <w:t>1583</w:t>
             </w:r>
           </w:p>
         </w:tc>
@@ -24450,7 +24863,7 @@
                 <w:rFonts w:cs="Times New Roman"/>
                 <w:sz w:val="20"/>
               </w:rPr>
-              <w:t>2194</w:t>
+              <w:t>2418</w:t>
             </w:r>
           </w:p>
         </w:tc>
@@ -25241,6 +25654,34 @@
           <w:sz w:val="16"/>
         </w:rPr>
         <w:t xml:space="preserve">            continue; // the allocation itself failed: nothing to leak</w:t>
+      </w:r>
+    </w:p>
+    <w:p>
+      <w:pPr>
+        <w:shd w:val="clear" w:color="auto" w:fill="F3F3F1"/>
+        <w:spacing w:after="0" w:line="240" w:lineRule="auto"/>
+        <w:ind w:left="283"/>
+      </w:pPr>
+      <w:r>
+        <w:rPr>
+          <w:rFonts w:ascii="Consolas" w:eastAsia="Consolas" w:hAnsi="Consolas" w:cs="Consolas"/>
+          <w:sz w:val="16"/>
+        </w:rPr>
+        <w:t xml:space="preserve">        if (errPtrTest(K, KeyValue) &amp;&amp; !Reallocated)</w:t>
+      </w:r>
+    </w:p>
+    <w:p>
+      <w:pPr>
+        <w:shd w:val="clear" w:color="auto" w:fill="F3F3F1"/>
+        <w:spacing w:after="0" w:line="240" w:lineRule="auto"/>
+        <w:ind w:left="283"/>
+      </w:pPr>
+      <w:r>
+        <w:rPr>
+          <w:rFonts w:ascii="Consolas" w:eastAsia="Consolas" w:hAnsi="Consolas" w:cs="Consolas"/>
+          <w:sz w:val="16"/>
+        </w:rPr>
+        <w:t xml:space="preserve">          continue; // tracked pointer is an ERR_PTR here: nothing to free</w:t>
       </w:r>
     </w:p>
     <w:p>
@@ -32643,7 +33084,7 @@
     <w:autoRedefine/>
     <w:uiPriority w:val="39"/>
     <w:unhideWhenUsed/>
-    <w:rsid w:val="00FE4D71"/>
+    <w:rsid w:val="00C608D3"/>
     <w:pPr>
       <w:spacing w:after="100"/>
     </w:pPr>
@@ -32655,7 +33096,7 @@
     <w:autoRedefine/>
     <w:uiPriority w:val="39"/>
     <w:unhideWhenUsed/>
-    <w:rsid w:val="00FE4D71"/>
+    <w:rsid w:val="00C608D3"/>
     <w:pPr>
       <w:spacing w:after="100"/>
       <w:ind w:left="240"/>

</xml_diff>

<commit_message>
Live kernel demo, VM window, dashboard Live kernel page, fresh benchmark run
- scripts/live_demo.py: narrated demo inside the guest kernel (SLUB leak via
  erofs fault 85, historical bonding leak) and a root shell; --window shows
  the VM's own screen in a QEMU window; module frames symbolised in the guest
- dashboard: Live kernel page streaming the guest console (demo / shell,
  optional VM window, Stop); finished guests are reaped correctly
- benchmark re-run end to end with the final analyser (fresh baselines);
  report shows all repeated runs plus the final one
- manual, report, handoff and generated documents updated
</commit_message>
<xml_diff>
--- a/docs/KernelLeakGuard_Final_Report.docx
+++ b/docs/KernelLeakGuard_Final_Report.docx
@@ -1055,7 +1055,7 @@
       <w:r>
         <w:fldChar w:fldCharType="separate"/>
       </w:r>
-      <w:hyperlink w:anchor="_Toc243427970" w:history="1">
+      <w:hyperlink w:anchor="_Toc243686824" w:history="1">
         <w:r>
           <w:rPr>
             <w:rStyle w:val="Hyperlink"/>
@@ -1082,7 +1082,7 @@
             <w:noProof/>
             <w:webHidden/>
           </w:rPr>
-          <w:instrText xml:space="preserve"> PAGEREF _Toc243427970 \h </w:instrText>
+          <w:instrText xml:space="preserve"> PAGEREF _Toc243686824 \h </w:instrText>
         </w:r>
         <w:r>
           <w:rPr>
@@ -1126,7 +1126,7 @@
           <w:lang w:eastAsia="en-IN"/>
         </w:rPr>
       </w:pPr>
-      <w:hyperlink w:anchor="_Toc243427971" w:history="1">
+      <w:hyperlink w:anchor="_Toc243686825" w:history="1">
         <w:r>
           <w:rPr>
             <w:rStyle w:val="Hyperlink"/>
@@ -1153,7 +1153,7 @@
             <w:noProof/>
             <w:webHidden/>
           </w:rPr>
-          <w:instrText xml:space="preserve"> PAGEREF _Toc243427971 \h </w:instrText>
+          <w:instrText xml:space="preserve"> PAGEREF _Toc243686825 \h </w:instrText>
         </w:r>
         <w:r>
           <w:rPr>
@@ -1197,7 +1197,7 @@
           <w:lang w:eastAsia="en-IN"/>
         </w:rPr>
       </w:pPr>
-      <w:hyperlink w:anchor="_Toc243427972" w:history="1">
+      <w:hyperlink w:anchor="_Toc243686826" w:history="1">
         <w:r>
           <w:rPr>
             <w:rStyle w:val="Hyperlink"/>
@@ -1224,7 +1224,7 @@
             <w:noProof/>
             <w:webHidden/>
           </w:rPr>
-          <w:instrText xml:space="preserve"> PAGEREF _Toc243427972 \h </w:instrText>
+          <w:instrText xml:space="preserve"> PAGEREF _Toc243686826 \h </w:instrText>
         </w:r>
         <w:r>
           <w:rPr>
@@ -1268,7 +1268,7 @@
           <w:lang w:eastAsia="en-IN"/>
         </w:rPr>
       </w:pPr>
-      <w:hyperlink w:anchor="_Toc243427973" w:history="1">
+      <w:hyperlink w:anchor="_Toc243686827" w:history="1">
         <w:r>
           <w:rPr>
             <w:rStyle w:val="Hyperlink"/>
@@ -1295,7 +1295,7 @@
             <w:noProof/>
             <w:webHidden/>
           </w:rPr>
-          <w:instrText xml:space="preserve"> PAGEREF _Toc243427973 \h </w:instrText>
+          <w:instrText xml:space="preserve"> PAGEREF _Toc243686827 \h </w:instrText>
         </w:r>
         <w:r>
           <w:rPr>
@@ -1339,7 +1339,7 @@
           <w:lang w:eastAsia="en-IN"/>
         </w:rPr>
       </w:pPr>
-      <w:hyperlink w:anchor="_Toc243427974" w:history="1">
+      <w:hyperlink w:anchor="_Toc243686828" w:history="1">
         <w:r>
           <w:rPr>
             <w:rStyle w:val="Hyperlink"/>
@@ -1366,7 +1366,7 @@
             <w:noProof/>
             <w:webHidden/>
           </w:rPr>
-          <w:instrText xml:space="preserve"> PAGEREF _Toc243427974 \h </w:instrText>
+          <w:instrText xml:space="preserve"> PAGEREF _Toc243686828 \h </w:instrText>
         </w:r>
         <w:r>
           <w:rPr>
@@ -1410,7 +1410,7 @@
           <w:lang w:eastAsia="en-IN"/>
         </w:rPr>
       </w:pPr>
-      <w:hyperlink w:anchor="_Toc243427975" w:history="1">
+      <w:hyperlink w:anchor="_Toc243686829" w:history="1">
         <w:r>
           <w:rPr>
             <w:rStyle w:val="Hyperlink"/>
@@ -1437,7 +1437,7 @@
             <w:noProof/>
             <w:webHidden/>
           </w:rPr>
-          <w:instrText xml:space="preserve"> PAGEREF _Toc243427975 \h </w:instrText>
+          <w:instrText xml:space="preserve"> PAGEREF _Toc243686829 \h </w:instrText>
         </w:r>
         <w:r>
           <w:rPr>
@@ -1481,7 +1481,7 @@
           <w:lang w:eastAsia="en-IN"/>
         </w:rPr>
       </w:pPr>
-      <w:hyperlink w:anchor="_Toc243427976" w:history="1">
+      <w:hyperlink w:anchor="_Toc243686830" w:history="1">
         <w:r>
           <w:rPr>
             <w:rStyle w:val="Hyperlink"/>
@@ -1508,7 +1508,7 @@
             <w:noProof/>
             <w:webHidden/>
           </w:rPr>
-          <w:instrText xml:space="preserve"> PAGEREF _Toc243427976 \h </w:instrText>
+          <w:instrText xml:space="preserve"> PAGEREF _Toc243686830 \h </w:instrText>
         </w:r>
         <w:r>
           <w:rPr>
@@ -1552,7 +1552,7 @@
           <w:lang w:eastAsia="en-IN"/>
         </w:rPr>
       </w:pPr>
-      <w:hyperlink w:anchor="_Toc243427977" w:history="1">
+      <w:hyperlink w:anchor="_Toc243686831" w:history="1">
         <w:r>
           <w:rPr>
             <w:rStyle w:val="Hyperlink"/>
@@ -1579,7 +1579,7 @@
             <w:noProof/>
             <w:webHidden/>
           </w:rPr>
-          <w:instrText xml:space="preserve"> PAGEREF _Toc243427977 \h </w:instrText>
+          <w:instrText xml:space="preserve"> PAGEREF _Toc243686831 \h </w:instrText>
         </w:r>
         <w:r>
           <w:rPr>
@@ -1623,7 +1623,7 @@
           <w:lang w:eastAsia="en-IN"/>
         </w:rPr>
       </w:pPr>
-      <w:hyperlink w:anchor="_Toc243427978" w:history="1">
+      <w:hyperlink w:anchor="_Toc243686832" w:history="1">
         <w:r>
           <w:rPr>
             <w:rStyle w:val="Hyperlink"/>
@@ -1650,7 +1650,7 @@
             <w:noProof/>
             <w:webHidden/>
           </w:rPr>
-          <w:instrText xml:space="preserve"> PAGEREF _Toc243427978 \h </w:instrText>
+          <w:instrText xml:space="preserve"> PAGEREF _Toc243686832 \h </w:instrText>
         </w:r>
         <w:r>
           <w:rPr>
@@ -1694,7 +1694,7 @@
           <w:lang w:eastAsia="en-IN"/>
         </w:rPr>
       </w:pPr>
-      <w:hyperlink w:anchor="_Toc243427979" w:history="1">
+      <w:hyperlink w:anchor="_Toc243686833" w:history="1">
         <w:r>
           <w:rPr>
             <w:rStyle w:val="Hyperlink"/>
@@ -1721,7 +1721,7 @@
             <w:noProof/>
             <w:webHidden/>
           </w:rPr>
-          <w:instrText xml:space="preserve"> PAGEREF _Toc243427979 \h </w:instrText>
+          <w:instrText xml:space="preserve"> PAGEREF _Toc243686833 \h </w:instrText>
         </w:r>
         <w:r>
           <w:rPr>
@@ -1765,7 +1765,7 @@
           <w:lang w:eastAsia="en-IN"/>
         </w:rPr>
       </w:pPr>
-      <w:hyperlink w:anchor="_Toc243427980" w:history="1">
+      <w:hyperlink w:anchor="_Toc243686834" w:history="1">
         <w:r>
           <w:rPr>
             <w:rStyle w:val="Hyperlink"/>
@@ -1792,7 +1792,7 @@
             <w:noProof/>
             <w:webHidden/>
           </w:rPr>
-          <w:instrText xml:space="preserve"> PAGEREF _Toc243427980 \h </w:instrText>
+          <w:instrText xml:space="preserve"> PAGEREF _Toc243686834 \h </w:instrText>
         </w:r>
         <w:r>
           <w:rPr>
@@ -1836,7 +1836,7 @@
           <w:lang w:eastAsia="en-IN"/>
         </w:rPr>
       </w:pPr>
-      <w:hyperlink w:anchor="_Toc243427981" w:history="1">
+      <w:hyperlink w:anchor="_Toc243686835" w:history="1">
         <w:r>
           <w:rPr>
             <w:rStyle w:val="Hyperlink"/>
@@ -1863,7 +1863,7 @@
             <w:noProof/>
             <w:webHidden/>
           </w:rPr>
-          <w:instrText xml:space="preserve"> PAGEREF _Toc243427981 \h </w:instrText>
+          <w:instrText xml:space="preserve"> PAGEREF _Toc243686835 \h </w:instrText>
         </w:r>
         <w:r>
           <w:rPr>
@@ -1907,7 +1907,7 @@
           <w:lang w:eastAsia="en-IN"/>
         </w:rPr>
       </w:pPr>
-      <w:hyperlink w:anchor="_Toc243427982" w:history="1">
+      <w:hyperlink w:anchor="_Toc243686836" w:history="1">
         <w:r>
           <w:rPr>
             <w:rStyle w:val="Hyperlink"/>
@@ -1934,7 +1934,7 @@
             <w:noProof/>
             <w:webHidden/>
           </w:rPr>
-          <w:instrText xml:space="preserve"> PAGEREF _Toc243427982 \h </w:instrText>
+          <w:instrText xml:space="preserve"> PAGEREF _Toc243686836 \h </w:instrText>
         </w:r>
         <w:r>
           <w:rPr>
@@ -1978,7 +1978,7 @@
           <w:lang w:eastAsia="en-IN"/>
         </w:rPr>
       </w:pPr>
-      <w:hyperlink w:anchor="_Toc243427983" w:history="1">
+      <w:hyperlink w:anchor="_Toc243686837" w:history="1">
         <w:r>
           <w:rPr>
             <w:rStyle w:val="Hyperlink"/>
@@ -2005,7 +2005,7 @@
             <w:noProof/>
             <w:webHidden/>
           </w:rPr>
-          <w:instrText xml:space="preserve"> PAGEREF _Toc243427983 \h </w:instrText>
+          <w:instrText xml:space="preserve"> PAGEREF _Toc243686837 \h </w:instrText>
         </w:r>
         <w:r>
           <w:rPr>
@@ -2049,7 +2049,7 @@
           <w:lang w:eastAsia="en-IN"/>
         </w:rPr>
       </w:pPr>
-      <w:hyperlink w:anchor="_Toc243427984" w:history="1">
+      <w:hyperlink w:anchor="_Toc243686838" w:history="1">
         <w:r>
           <w:rPr>
             <w:rStyle w:val="Hyperlink"/>
@@ -2076,7 +2076,7 @@
             <w:noProof/>
             <w:webHidden/>
           </w:rPr>
-          <w:instrText xml:space="preserve"> PAGEREF _Toc243427984 \h </w:instrText>
+          <w:instrText xml:space="preserve"> PAGEREF _Toc243686838 \h </w:instrText>
         </w:r>
         <w:r>
           <w:rPr>
@@ -2120,7 +2120,7 @@
           <w:lang w:eastAsia="en-IN"/>
         </w:rPr>
       </w:pPr>
-      <w:hyperlink w:anchor="_Toc243427985" w:history="1">
+      <w:hyperlink w:anchor="_Toc243686839" w:history="1">
         <w:r>
           <w:rPr>
             <w:rStyle w:val="Hyperlink"/>
@@ -2147,7 +2147,7 @@
             <w:noProof/>
             <w:webHidden/>
           </w:rPr>
-          <w:instrText xml:space="preserve"> PAGEREF _Toc243427985 \h </w:instrText>
+          <w:instrText xml:space="preserve"> PAGEREF _Toc243686839 \h </w:instrText>
         </w:r>
         <w:r>
           <w:rPr>
@@ -2191,7 +2191,7 @@
           <w:lang w:eastAsia="en-IN"/>
         </w:rPr>
       </w:pPr>
-      <w:hyperlink w:anchor="_Toc243427986" w:history="1">
+      <w:hyperlink w:anchor="_Toc243686840" w:history="1">
         <w:r>
           <w:rPr>
             <w:rStyle w:val="Hyperlink"/>
@@ -2218,7 +2218,7 @@
             <w:noProof/>
             <w:webHidden/>
           </w:rPr>
-          <w:instrText xml:space="preserve"> PAGEREF _Toc243427986 \h </w:instrText>
+          <w:instrText xml:space="preserve"> PAGEREF _Toc243686840 \h </w:instrText>
         </w:r>
         <w:r>
           <w:rPr>
@@ -2262,7 +2262,7 @@
           <w:lang w:eastAsia="en-IN"/>
         </w:rPr>
       </w:pPr>
-      <w:hyperlink w:anchor="_Toc243427987" w:history="1">
+      <w:hyperlink w:anchor="_Toc243686841" w:history="1">
         <w:r>
           <w:rPr>
             <w:rStyle w:val="Hyperlink"/>
@@ -2289,7 +2289,7 @@
             <w:noProof/>
             <w:webHidden/>
           </w:rPr>
-          <w:instrText xml:space="preserve"> PAGEREF _Toc243427987 \h </w:instrText>
+          <w:instrText xml:space="preserve"> PAGEREF _Toc243686841 \h </w:instrText>
         </w:r>
         <w:r>
           <w:rPr>
@@ -2333,7 +2333,7 @@
           <w:lang w:eastAsia="en-IN"/>
         </w:rPr>
       </w:pPr>
-      <w:hyperlink w:anchor="_Toc243427988" w:history="1">
+      <w:hyperlink w:anchor="_Toc243686842" w:history="1">
         <w:r>
           <w:rPr>
             <w:rStyle w:val="Hyperlink"/>
@@ -2360,7 +2360,7 @@
             <w:noProof/>
             <w:webHidden/>
           </w:rPr>
-          <w:instrText xml:space="preserve"> PAGEREF _Toc243427988 \h </w:instrText>
+          <w:instrText xml:space="preserve"> PAGEREF _Toc243686842 \h </w:instrText>
         </w:r>
         <w:r>
           <w:rPr>
@@ -2404,7 +2404,7 @@
           <w:lang w:eastAsia="en-IN"/>
         </w:rPr>
       </w:pPr>
-      <w:hyperlink w:anchor="_Toc243427989" w:history="1">
+      <w:hyperlink w:anchor="_Toc243686843" w:history="1">
         <w:r>
           <w:rPr>
             <w:rStyle w:val="Hyperlink"/>
@@ -2431,7 +2431,7 @@
             <w:noProof/>
             <w:webHidden/>
           </w:rPr>
-          <w:instrText xml:space="preserve"> PAGEREF _Toc243427989 \h </w:instrText>
+          <w:instrText xml:space="preserve"> PAGEREF _Toc243686843 \h </w:instrText>
         </w:r>
         <w:r>
           <w:rPr>
@@ -2475,7 +2475,7 @@
           <w:lang w:eastAsia="en-IN"/>
         </w:rPr>
       </w:pPr>
-      <w:hyperlink w:anchor="_Toc243427990" w:history="1">
+      <w:hyperlink w:anchor="_Toc243686844" w:history="1">
         <w:r>
           <w:rPr>
             <w:rStyle w:val="Hyperlink"/>
@@ -2502,7 +2502,7 @@
             <w:noProof/>
             <w:webHidden/>
           </w:rPr>
-          <w:instrText xml:space="preserve"> PAGEREF _Toc243427990 \h </w:instrText>
+          <w:instrText xml:space="preserve"> PAGEREF _Toc243686844 \h </w:instrText>
         </w:r>
         <w:r>
           <w:rPr>
@@ -2546,7 +2546,7 @@
           <w:lang w:eastAsia="en-IN"/>
         </w:rPr>
       </w:pPr>
-      <w:hyperlink w:anchor="_Toc243427991" w:history="1">
+      <w:hyperlink w:anchor="_Toc243686845" w:history="1">
         <w:r>
           <w:rPr>
             <w:rStyle w:val="Hyperlink"/>
@@ -2573,7 +2573,7 @@
             <w:noProof/>
             <w:webHidden/>
           </w:rPr>
-          <w:instrText xml:space="preserve"> PAGEREF _Toc243427991 \h </w:instrText>
+          <w:instrText xml:space="preserve"> PAGEREF _Toc243686845 \h </w:instrText>
         </w:r>
         <w:r>
           <w:rPr>
@@ -2617,7 +2617,7 @@
           <w:lang w:eastAsia="en-IN"/>
         </w:rPr>
       </w:pPr>
-      <w:hyperlink w:anchor="_Toc243427992" w:history="1">
+      <w:hyperlink w:anchor="_Toc243686846" w:history="1">
         <w:r>
           <w:rPr>
             <w:rStyle w:val="Hyperlink"/>
@@ -2644,7 +2644,7 @@
             <w:noProof/>
             <w:webHidden/>
           </w:rPr>
-          <w:instrText xml:space="preserve"> PAGEREF _Toc243427992 \h </w:instrText>
+          <w:instrText xml:space="preserve"> PAGEREF _Toc243686846 \h </w:instrText>
         </w:r>
         <w:r>
           <w:rPr>
@@ -2688,7 +2688,7 @@
           <w:lang w:eastAsia="en-IN"/>
         </w:rPr>
       </w:pPr>
-      <w:hyperlink w:anchor="_Toc243427993" w:history="1">
+      <w:hyperlink w:anchor="_Toc243686847" w:history="1">
         <w:r>
           <w:rPr>
             <w:rStyle w:val="Hyperlink"/>
@@ -2715,7 +2715,7 @@
             <w:noProof/>
             <w:webHidden/>
           </w:rPr>
-          <w:instrText xml:space="preserve"> PAGEREF _Toc243427993 \h </w:instrText>
+          <w:instrText xml:space="preserve"> PAGEREF _Toc243686847 \h </w:instrText>
         </w:r>
         <w:r>
           <w:rPr>
@@ -2759,7 +2759,7 @@
           <w:lang w:eastAsia="en-IN"/>
         </w:rPr>
       </w:pPr>
-      <w:hyperlink w:anchor="_Toc243427994" w:history="1">
+      <w:hyperlink w:anchor="_Toc243686848" w:history="1">
         <w:r>
           <w:rPr>
             <w:rStyle w:val="Hyperlink"/>
@@ -2786,7 +2786,7 @@
             <w:noProof/>
             <w:webHidden/>
           </w:rPr>
-          <w:instrText xml:space="preserve"> PAGEREF _Toc243427994 \h </w:instrText>
+          <w:instrText xml:space="preserve"> PAGEREF _Toc243686848 \h </w:instrText>
         </w:r>
         <w:r>
           <w:rPr>
@@ -2830,7 +2830,7 @@
           <w:lang w:eastAsia="en-IN"/>
         </w:rPr>
       </w:pPr>
-      <w:hyperlink w:anchor="_Toc243427995" w:history="1">
+      <w:hyperlink w:anchor="_Toc243686849" w:history="1">
         <w:r>
           <w:rPr>
             <w:rStyle w:val="Hyperlink"/>
@@ -2857,7 +2857,7 @@
             <w:noProof/>
             <w:webHidden/>
           </w:rPr>
-          <w:instrText xml:space="preserve"> PAGEREF _Toc243427995 \h </w:instrText>
+          <w:instrText xml:space="preserve"> PAGEREF _Toc243686849 \h </w:instrText>
         </w:r>
         <w:r>
           <w:rPr>
@@ -2901,7 +2901,7 @@
           <w:lang w:eastAsia="en-IN"/>
         </w:rPr>
       </w:pPr>
-      <w:hyperlink w:anchor="_Toc243427996" w:history="1">
+      <w:hyperlink w:anchor="_Toc243686850" w:history="1">
         <w:r>
           <w:rPr>
             <w:rStyle w:val="Hyperlink"/>
@@ -2928,7 +2928,7 @@
             <w:noProof/>
             <w:webHidden/>
           </w:rPr>
-          <w:instrText xml:space="preserve"> PAGEREF _Toc243427996 \h </w:instrText>
+          <w:instrText xml:space="preserve"> PAGEREF _Toc243686850 \h </w:instrText>
         </w:r>
         <w:r>
           <w:rPr>
@@ -2972,7 +2972,7 @@
           <w:lang w:eastAsia="en-IN"/>
         </w:rPr>
       </w:pPr>
-      <w:hyperlink w:anchor="_Toc243427997" w:history="1">
+      <w:hyperlink w:anchor="_Toc243686851" w:history="1">
         <w:r>
           <w:rPr>
             <w:rStyle w:val="Hyperlink"/>
@@ -2999,7 +2999,7 @@
             <w:noProof/>
             <w:webHidden/>
           </w:rPr>
-          <w:instrText xml:space="preserve"> PAGEREF _Toc243427997 \h </w:instrText>
+          <w:instrText xml:space="preserve"> PAGEREF _Toc243686851 \h </w:instrText>
         </w:r>
         <w:r>
           <w:rPr>
@@ -3043,7 +3043,7 @@
           <w:lang w:eastAsia="en-IN"/>
         </w:rPr>
       </w:pPr>
-      <w:hyperlink w:anchor="_Toc243427998" w:history="1">
+      <w:hyperlink w:anchor="_Toc243686852" w:history="1">
         <w:r>
           <w:rPr>
             <w:rStyle w:val="Hyperlink"/>
@@ -3070,7 +3070,7 @@
             <w:noProof/>
             <w:webHidden/>
           </w:rPr>
-          <w:instrText xml:space="preserve"> PAGEREF _Toc243427998 \h </w:instrText>
+          <w:instrText xml:space="preserve"> PAGEREF _Toc243686852 \h </w:instrText>
         </w:r>
         <w:r>
           <w:rPr>
@@ -3114,7 +3114,7 @@
           <w:lang w:eastAsia="en-IN"/>
         </w:rPr>
       </w:pPr>
-      <w:hyperlink w:anchor="_Toc243427999" w:history="1">
+      <w:hyperlink w:anchor="_Toc243686853" w:history="1">
         <w:r>
           <w:rPr>
             <w:rStyle w:val="Hyperlink"/>
@@ -3141,7 +3141,7 @@
             <w:noProof/>
             <w:webHidden/>
           </w:rPr>
-          <w:instrText xml:space="preserve"> PAGEREF _Toc243427999 \h </w:instrText>
+          <w:instrText xml:space="preserve"> PAGEREF _Toc243686853 \h </w:instrText>
         </w:r>
         <w:r>
           <w:rPr>
@@ -3279,7 +3279,7 @@
         <w:pageBreakBefore/>
         <w:jc w:val="center"/>
       </w:pPr>
-      <w:bookmarkStart w:id="0" w:name="_Toc243427970"/>
+      <w:bookmarkStart w:id="0" w:name="_Toc243686824"/>
       <w:r>
         <w:lastRenderedPageBreak/>
         <w:t>ABSTRACT</w:t>
@@ -3328,13 +3328,13 @@
         <w:rPr>
           <w:rFonts w:cs="Times New Roman"/>
         </w:rPr>
-        <w:t>On a benchmark of 32 kernel modules with 17 leaking and 42 safe allocation sites, the static analyser reaches precision 0.94 and recall 0.94 (a naive missing-kfree analysis: precision 0.59). Runtime verification confirmed 15 of 17 warnings with kernel evidence and raised precision to 1.00 with no false confirmations. Together with the leaks its own fault-point sweep exposes, KernelLeakGuard finds 16 of the 17 leaks with no false positive (F1 0.97), using 425 executions of kernel routines in total against 12</w:t>
+        <w:t>On a benchmark of 32 kernel modules with 17 leaking and 42 safe allocation sites, the static analyser reaches precision 0.94 and recall 0.94 (a naive missing-kfree analysis: precision 0.59). Runtime verification confirmed 15 of 17 warnings with kernel evidence and raised precision to 1.00 with no false confirmations. Together with the leaks its own fault-point sweep exposes, KernelLeakGuard finds 16 of the 17 leaks with no false positive (F1 0.97), using 424 executions of kernel routines in total against 12</w:t>
       </w:r>
       <w:r>
         <w:rPr>
           <w:rFonts w:cs="Times New Roman"/>
         </w:rPr>
-        <w:t>61 for exhaustive fault injection (F1 0.94) and 0.50 F1 for the cppcheck analyser. For 14 of 15 confirmed leaks it generates a fix patch validated by compilation, re-analysis and an exhaustive re-run in the VM. The complete pipeline runs in about 2 minutes on a laptop.</w:t>
+        <w:t>79 for exhaustive fault injection (F1 0.97) and 0.50 F1 for the cppcheck analyser. For 14 of 15 confirmed leaks it generates a fix patch validated by compilation, re-analysis and an exhaustive re-run in the VM. The complete pipeline runs in about 6 minutes on a laptop.</w:t>
       </w:r>
     </w:p>
     <w:p>
@@ -3367,7 +3367,7 @@
         <w:pageBreakBefore/>
         <w:jc w:val="center"/>
       </w:pPr>
-      <w:bookmarkStart w:id="1" w:name="_Toc243427971"/>
+      <w:bookmarkStart w:id="1" w:name="_Toc243686825"/>
       <w:r>
         <w:lastRenderedPageBreak/>
         <w:t>CHAPTER 1: INTRODUCTION</w:t>
@@ -3378,7 +3378,7 @@
       <w:pPr>
         <w:pStyle w:val="Heading2"/>
       </w:pPr>
-      <w:bookmarkStart w:id="2" w:name="_Toc243427972"/>
+      <w:bookmarkStart w:id="2" w:name="_Toc243686826"/>
       <w:r>
         <w:t>1.1 Motivation</w:t>
       </w:r>
@@ -3427,7 +3427,7 @@
       <w:pPr>
         <w:pStyle w:val="Heading2"/>
       </w:pPr>
-      <w:bookmarkStart w:id="3" w:name="_Toc243427973"/>
+      <w:bookmarkStart w:id="3" w:name="_Toc243686827"/>
       <w:r>
         <w:t>1.2 Scope</w:t>
       </w:r>
@@ -3486,7 +3486,7 @@
       <w:pPr>
         <w:pStyle w:val="Heading2"/>
       </w:pPr>
-      <w:bookmarkStart w:id="4" w:name="_Toc243427974"/>
+      <w:bookmarkStart w:id="4" w:name="_Toc243686828"/>
       <w:r>
         <w:t>1.3 Problem Statement</w:t>
       </w:r>
@@ -3507,7 +3507,7 @@
       <w:pPr>
         <w:pStyle w:val="Heading2"/>
       </w:pPr>
-      <w:bookmarkStart w:id="5" w:name="_Toc243427975"/>
+      <w:bookmarkStart w:id="5" w:name="_Toc243686829"/>
       <w:r>
         <w:t>1.4 Objectives</w:t>
       </w:r>
@@ -3631,7 +3631,7 @@
       <w:pPr>
         <w:pStyle w:val="Heading2"/>
       </w:pPr>
-      <w:bookmarkStart w:id="6" w:name="_Toc243427976"/>
+      <w:bookmarkStart w:id="6" w:name="_Toc243686830"/>
       <w:r>
         <w:t>1.5 Organization of the Report</w:t>
       </w:r>
@@ -3661,7 +3661,7 @@
         <w:pageBreakBefore/>
         <w:jc w:val="center"/>
       </w:pPr>
-      <w:bookmarkStart w:id="7" w:name="_Toc243427977"/>
+      <w:bookmarkStart w:id="7" w:name="_Toc243686831"/>
       <w:r>
         <w:lastRenderedPageBreak/>
         <w:t>CHAPTER 2: LITERATURE SURVEY</w:t>
@@ -3672,7 +3672,7 @@
       <w:pPr>
         <w:pStyle w:val="Heading2"/>
       </w:pPr>
-      <w:bookmarkStart w:id="8" w:name="_Toc243427978"/>
+      <w:bookmarkStart w:id="8" w:name="_Toc243686832"/>
       <w:r>
         <w:t>2.1 Overview</w:t>
       </w:r>
@@ -3699,7 +3699,7 @@
       <w:pPr>
         <w:pStyle w:val="Heading2"/>
       </w:pPr>
-      <w:bookmarkStart w:id="9" w:name="_Toc243427979"/>
+      <w:bookmarkStart w:id="9" w:name="_Toc243686833"/>
       <w:r>
         <w:t>2.2 Review of Existing Methods</w:t>
       </w:r>
@@ -3836,7 +3836,7 @@
       <w:pPr>
         <w:pStyle w:val="Heading2"/>
       </w:pPr>
-      <w:bookmarkStart w:id="10" w:name="_Toc243427980"/>
+      <w:bookmarkStart w:id="10" w:name="_Toc243686834"/>
       <w:r>
         <w:t>2.3 Comparative Analysis</w:t>
       </w:r>
@@ -4610,7 +4610,7 @@
       <w:pPr>
         <w:pStyle w:val="Heading2"/>
       </w:pPr>
-      <w:bookmarkStart w:id="11" w:name="_Toc243427981"/>
+      <w:bookmarkStart w:id="11" w:name="_Toc243686835"/>
       <w:r>
         <w:t>2.4 Research Gap</w:t>
       </w:r>
@@ -4651,7 +4651,7 @@
         <w:pageBreakBefore/>
         <w:jc w:val="center"/>
       </w:pPr>
-      <w:bookmarkStart w:id="12" w:name="_Toc243427982"/>
+      <w:bookmarkStart w:id="12" w:name="_Toc243686836"/>
       <w:r>
         <w:lastRenderedPageBreak/>
         <w:t>CHAPTER 3: PROPOSED TECHNIQUE</w:t>
@@ -4662,7 +4662,7 @@
       <w:pPr>
         <w:pStyle w:val="Heading2"/>
       </w:pPr>
-      <w:bookmarkStart w:id="13" w:name="_Toc243427983"/>
+      <w:bookmarkStart w:id="13" w:name="_Toc243686837"/>
       <w:r>
         <w:t>3.1 System Architecture</w:t>
       </w:r>
@@ -4689,7 +4689,7 @@
           <w:noProof/>
         </w:rPr>
         <w:drawing>
-          <wp:inline distT="0" distB="0" distL="0" distR="0" wp14:anchorId="6861E8F3" wp14:editId="0F32AF56">
+          <wp:inline distT="0" distB="0" distL="0" distR="0" wp14:anchorId="1796D5DC" wp14:editId="109714B8">
             <wp:extent cx="5940000" cy="3024000"/>
             <wp:effectExtent l="0" t="0" r="0" b="0"/>
             <wp:docPr id="9" name="Picture 9"/>
@@ -4882,7 +4882,7 @@
       <w:pPr>
         <w:pStyle w:val="Heading2"/>
       </w:pPr>
-      <w:bookmarkStart w:id="14" w:name="_Toc243427984"/>
+      <w:bookmarkStart w:id="14" w:name="_Toc243686838"/>
       <w:r>
         <w:lastRenderedPageBreak/>
         <w:t>3.2 Module-wise Description</w:t>
@@ -5136,13 +5136,13 @@
         <w:rPr>
           <w:rFonts w:cs="Times New Roman"/>
         </w:rPr>
-        <w:t>The klg package builds modules and IR, runs the analyser, generates the guest job scripts, boots the VM, symbolises stack frames with the kernel's faddr2line script, plans the confirmation tests, schedules them in kmemleak rounds so that leaks can be attributed unambiguously, and computes verdicts and metrics. The Streamlit dashboard lists findings with verdicts, highlights the allocation, failing call and leaking exit in the source, shows the kmemleak backtraces, compares approaches and can run the pipelin</w:t>
+        <w:t>The klg package builds modules and IR, runs the analyser, generates the guest job scripts, boots the VM, symbolises stack frames with the kernel's faddr2line script, plans the confirmation tests, schedules them in kmemleak rounds so that leaks can be attributed unambiguously, and computes verdicts and metrics. The Streamlit dashboard lists findings with verdicts, highlights the allocation, failing call and leaking exit in the source, shows the kmemleak backtraces, compares approaches, presents the real-kern</w:t>
       </w:r>
       <w:r>
         <w:rPr>
           <w:rFonts w:cs="Times New Roman"/>
         </w:rPr>
-        <w:t>e.</w:t>
+        <w:t>el findings with their patches, can run the pipeline, and has a live page that boots the guest kernel and streams its console, so that a leak being caught by kmemleak can be watched as it happens.</w:t>
       </w:r>
     </w:p>
     <w:p>
@@ -5543,7 +5543,7 @@
       <w:pPr>
         <w:pStyle w:val="Heading2"/>
       </w:pPr>
-      <w:bookmarkStart w:id="15" w:name="_Toc243427985"/>
+      <w:bookmarkStart w:id="15" w:name="_Toc243686839"/>
       <w:r>
         <w:t>3.3 Algorithms Used</w:t>
       </w:r>
@@ -5768,6 +5768,7 @@
           <w:rFonts w:ascii="Consolas" w:eastAsia="Consolas" w:hAnsi="Consolas" w:cs="Consolas"/>
           <w:sz w:val="16"/>
         </w:rPr>
+        <w:lastRenderedPageBreak/>
         <w:t xml:space="preserve">     if i is return: report(a, exit=i, value=resolve(retval, path), T); return</w:t>
       </w:r>
     </w:p>
@@ -5824,7 +5825,6 @@
           <w:rFonts w:ascii="Consolas" w:eastAsia="Consolas" w:hAnsi="Consolas" w:cs="Consolas"/>
           <w:sz w:val="16"/>
         </w:rPr>
-        <w:lastRenderedPageBreak/>
         <w:t xml:space="preserve">        if contradicts(D, key, v) and not stale: continue   # infeasible path</w:t>
       </w:r>
     </w:p>
@@ -6190,7 +6190,7 @@
       <w:pPr>
         <w:pStyle w:val="Heading2"/>
       </w:pPr>
-      <w:bookmarkStart w:id="16" w:name="_Toc243427986"/>
+      <w:bookmarkStart w:id="16" w:name="_Toc243686840"/>
       <w:r>
         <w:t>3.4 Dataset Details</w:t>
       </w:r>
@@ -6995,6 +6995,7 @@
                 <w:rFonts w:cs="Times New Roman"/>
                 <w:sz w:val="17"/>
               </w:rPr>
+              <w:lastRenderedPageBreak/>
               <w:t>l10_vmalloc</w:t>
             </w:r>
           </w:p>
@@ -7141,7 +7142,6 @@
                 <w:rFonts w:cs="Times New Roman"/>
                 <w:sz w:val="17"/>
               </w:rPr>
-              <w:lastRenderedPageBreak/>
               <w:t>l12_multi_exit</w:t>
             </w:r>
           </w:p>
@@ -9098,7 +9098,7 @@
       <w:pPr>
         <w:pStyle w:val="Heading2"/>
       </w:pPr>
-      <w:bookmarkStart w:id="17" w:name="_Toc243427987"/>
+      <w:bookmarkStart w:id="17" w:name="_Toc243686841"/>
       <w:r>
         <w:t>3.5 Tools and Technologies</w:t>
       </w:r>
@@ -9474,7 +9474,6 @@
           <w:b/>
           <w:sz w:val="22"/>
         </w:rPr>
-        <w:lastRenderedPageBreak/>
         <w:t>Table 3.5: Module division</w:t>
       </w:r>
     </w:p>
@@ -9732,7 +9731,7 @@
         <w:pageBreakBefore/>
         <w:jc w:val="center"/>
       </w:pPr>
-      <w:bookmarkStart w:id="18" w:name="_Toc243427988"/>
+      <w:bookmarkStart w:id="18" w:name="_Toc243686842"/>
       <w:r>
         <w:lastRenderedPageBreak/>
         <w:t>CHAPTER 4: RESULTS AND DISCUSSION</w:t>
@@ -9743,7 +9742,7 @@
       <w:pPr>
         <w:pStyle w:val="Heading2"/>
       </w:pPr>
-      <w:bookmarkStart w:id="19" w:name="_Toc243427989"/>
+      <w:bookmarkStart w:id="19" w:name="_Toc243686843"/>
       <w:r>
         <w:t>4.1 Experimental Setup</w:t>
       </w:r>
@@ -10078,7 +10077,7 @@
       <w:pPr>
         <w:pStyle w:val="Heading2"/>
       </w:pPr>
-      <w:bookmarkStart w:id="20" w:name="_Toc243427990"/>
+      <w:bookmarkStart w:id="20" w:name="_Toc243686844"/>
       <w:r>
         <w:t>4.2 Results</w:t>
       </w:r>
@@ -10793,7 +10792,7 @@
                 <w:rFonts w:cs="Times New Roman"/>
                 <w:sz w:val="20"/>
               </w:rPr>
-              <w:t>15</w:t>
+              <w:t>16</w:t>
             </w:r>
           </w:p>
         </w:tc>
@@ -10827,7 +10826,7 @@
                 <w:rFonts w:cs="Times New Roman"/>
                 <w:sz w:val="20"/>
               </w:rPr>
-              <w:t>2</w:t>
+              <w:t>1</w:t>
             </w:r>
           </w:p>
         </w:tc>
@@ -10861,7 +10860,7 @@
                 <w:rFonts w:cs="Times New Roman"/>
                 <w:sz w:val="20"/>
               </w:rPr>
-              <w:t>0.88</w:t>
+              <w:t>0.94</w:t>
             </w:r>
           </w:p>
         </w:tc>
@@ -10878,7 +10877,7 @@
                 <w:rFonts w:cs="Times New Roman"/>
                 <w:sz w:val="20"/>
               </w:rPr>
-              <w:t>0.94</w:t>
+              <w:t>0.97</w:t>
             </w:r>
           </w:p>
         </w:tc>
@@ -10917,7 +10916,7 @@
                 <w:rFonts w:cs="Times New Roman"/>
                 <w:sz w:val="20"/>
               </w:rPr>
-              <w:t>13</w:t>
+              <w:t>14</w:t>
             </w:r>
           </w:p>
         </w:tc>
@@ -10951,7 +10950,7 @@
                 <w:rFonts w:cs="Times New Roman"/>
                 <w:sz w:val="20"/>
               </w:rPr>
-              <w:t>4</w:t>
+              <w:t>3</w:t>
             </w:r>
           </w:p>
         </w:tc>
@@ -10985,7 +10984,7 @@
                 <w:rFonts w:cs="Times New Roman"/>
                 <w:sz w:val="20"/>
               </w:rPr>
-              <w:t>0.77</w:t>
+              <w:t>0.82</w:t>
             </w:r>
           </w:p>
         </w:tc>
@@ -11002,7 +11001,7 @@
                 <w:rFonts w:cs="Times New Roman"/>
                 <w:sz w:val="20"/>
               </w:rPr>
-              <w:t>0.87</w:t>
+              <w:t>0.90</w:t>
             </w:r>
           </w:p>
         </w:tc>
@@ -11148,7 +11147,7 @@
         </w:rPr>
         <w:lastRenderedPageBreak/>
         <w:drawing>
-          <wp:inline distT="0" distB="0" distL="0" distR="0" wp14:anchorId="267D2FCA" wp14:editId="2B9F1F0B">
+          <wp:inline distT="0" distB="0" distL="0" distR="0" wp14:anchorId="0F028860" wp14:editId="6F3680D2">
             <wp:extent cx="5580000" cy="2349474"/>
             <wp:effectExtent l="0" t="0" r="0" b="0"/>
             <wp:docPr id="10" name="Picture 10"/>
@@ -11224,7 +11223,7 @@
           <w:noProof/>
         </w:rPr>
         <w:drawing>
-          <wp:inline distT="0" distB="0" distL="0" distR="0" wp14:anchorId="1276A77D" wp14:editId="6D042C9E">
+          <wp:inline distT="0" distB="0" distL="0" distR="0" wp14:anchorId="18F8F01A" wp14:editId="211FDA02">
             <wp:extent cx="4320000" cy="2392615"/>
             <wp:effectExtent l="0" t="0" r="0" b="0"/>
             <wp:docPr id="11" name="Picture 11"/>
@@ -11303,7 +11302,7 @@
           <w:noProof/>
         </w:rPr>
         <w:drawing>
-          <wp:inline distT="0" distB="0" distL="0" distR="0" wp14:anchorId="54308ACE" wp14:editId="6549DFC5">
+          <wp:inline distT="0" distB="0" distL="0" distR="0" wp14:anchorId="5DFB39EB" wp14:editId="09E9D93F">
             <wp:extent cx="5400000" cy="2565000"/>
             <wp:effectExtent l="0" t="0" r="0" b="0"/>
             <wp:docPr id="12" name="Picture 12"/>
@@ -11362,7 +11361,7 @@
           <w:noProof/>
         </w:rPr>
         <w:drawing>
-          <wp:inline distT="0" distB="0" distL="0" distR="0" wp14:anchorId="5E1A67B9" wp14:editId="360A1846">
+          <wp:inline distT="0" distB="0" distL="0" distR="0" wp14:anchorId="6B3FF670" wp14:editId="0FDE1B81">
             <wp:extent cx="5400000" cy="2565000"/>
             <wp:effectExtent l="0" t="0" r="0" b="0"/>
             <wp:docPr id="13" name="Picture 13"/>
@@ -11735,7 +11734,7 @@
                 <w:rFonts w:cs="Times New Roman"/>
                 <w:sz w:val="20"/>
               </w:rPr>
-              <w:t>14</w:t>
+              <w:t>21</w:t>
             </w:r>
           </w:p>
         </w:tc>
@@ -11876,7 +11875,7 @@
                 <w:rFonts w:cs="Times New Roman"/>
                 <w:sz w:val="20"/>
               </w:rPr>
-              <w:t>15</w:t>
+              <w:t>22</w:t>
             </w:r>
           </w:p>
         </w:tc>
@@ -12017,7 +12016,7 @@
                 <w:rFonts w:cs="Times New Roman"/>
                 <w:sz w:val="20"/>
               </w:rPr>
-              <w:t>14</w:t>
+              <w:t>22</w:t>
             </w:r>
           </w:p>
         </w:tc>
@@ -12158,7 +12157,7 @@
                 <w:rFonts w:cs="Times New Roman"/>
                 <w:sz w:val="20"/>
               </w:rPr>
-              <w:t>15</w:t>
+              <w:t>22</w:t>
             </w:r>
           </w:p>
         </w:tc>
@@ -12300,7 +12299,7 @@
                 <w:rFonts w:cs="Times New Roman"/>
                 <w:sz w:val="20"/>
               </w:rPr>
-              <w:t>15</w:t>
+              <w:t>23</w:t>
             </w:r>
           </w:p>
         </w:tc>
@@ -12441,7 +12440,7 @@
                 <w:rFonts w:cs="Times New Roman"/>
                 <w:sz w:val="20"/>
               </w:rPr>
-              <w:t>14</w:t>
+              <w:t>24</w:t>
             </w:r>
           </w:p>
         </w:tc>
@@ -20637,7 +20636,7 @@
       <w:pPr>
         <w:pStyle w:val="Heading2"/>
       </w:pPr>
-      <w:bookmarkStart w:id="21" w:name="_Toc243427991"/>
+      <w:bookmarkStart w:id="21" w:name="_Toc243686845"/>
       <w:r>
         <w:lastRenderedPageBreak/>
         <w:t>4.3 Performance Metrics</w:t>
@@ -20654,7 +20653,7 @@
           <w:noProof/>
         </w:rPr>
         <w:drawing>
-          <wp:inline distT="0" distB="0" distL="0" distR="0" wp14:anchorId="3C51F6C5" wp14:editId="2F74A607">
+          <wp:inline distT="0" distB="0" distL="0" distR="0" wp14:anchorId="56D1DE3B" wp14:editId="4C476A61">
             <wp:extent cx="4320000" cy="2259692"/>
             <wp:effectExtent l="0" t="0" r="0" b="0"/>
             <wp:docPr id="14" name="Picture 14"/>
@@ -20844,7 +20843,7 @@
                 <w:rFonts w:cs="Times New Roman"/>
                 <w:sz w:val="20"/>
               </w:rPr>
-              <w:t>14 ms (0.5 ms per module)</w:t>
+              <w:t>24 ms (0.7 ms per module)</w:t>
             </w:r>
           </w:p>
         </w:tc>
@@ -20883,7 +20882,7 @@
                 <w:rFonts w:cs="Times New Roman"/>
                 <w:sz w:val="20"/>
               </w:rPr>
-              <w:t>0 s</w:t>
+              <w:t>80 s</w:t>
             </w:r>
           </w:p>
         </w:tc>
@@ -20922,7 +20921,7 @@
                 <w:rFonts w:cs="Times New Roman"/>
                 <w:sz w:val="20"/>
               </w:rPr>
-              <w:t>94 s</w:t>
+              <w:t>122 s</w:t>
             </w:r>
           </w:p>
         </w:tc>
@@ -20961,7 +20960,7 @@
                 <w:rFonts w:cs="Times New Roman"/>
                 <w:sz w:val="20"/>
               </w:rPr>
-              <w:t>0 s</w:t>
+              <w:t>146 s</w:t>
             </w:r>
           </w:p>
         </w:tc>
@@ -21039,7 +21038,7 @@
                 <w:rFonts w:cs="Times New Roman"/>
                 <w:sz w:val="20"/>
               </w:rPr>
-              <w:t>425 (304 + 121)</w:t>
+              <w:t>424 (303 + 121)</w:t>
             </w:r>
           </w:p>
         </w:tc>
@@ -21078,7 +21077,7 @@
                 <w:rFonts w:cs="Times New Roman"/>
                 <w:sz w:val="20"/>
               </w:rPr>
-              <w:t>1261</w:t>
+              <w:t>1279</w:t>
             </w:r>
           </w:p>
         </w:tc>
@@ -21136,13 +21135,13 @@
         <w:rPr>
           <w:rFonts w:cs="Times New Roman"/>
         </w:rPr>
-        <w:t>The complete pipeline was run 3 times from scratch (new VM boots, new fault-point sweeps); the main results above are those of the last run. The hybrid confirmed between 14 and 15 leaks with 0 false positives in every run. The variation comes from the vmalloc leak in klg_l10: kmemleak tracks a vmalloc area with a minimum reference count of two (the kernel's own vm_struct legitimately points to it), so a single extra stale copy of its address hides the leak in that scan. The dynamic baselines vary for the sa</w:t>
+        <w:t>The complete pipeline was run 3 times from scratch (new VM boots, new fault-point sweeps) with the analyser of the benchmark evaluation, and once more with the final analyser, whose run gives the main results above (its static results find the same sites; it drops two low-confidence warnings on impossible paths). The hybrid confirmed between 14 and 15 leaks with 0 false positives in every run. The variation comes from the vmalloc leak in klg_l10: kmemleak tracks a vmalloc area with a minimum reference count</w:t>
       </w:r>
       <w:r>
         <w:rPr>
           <w:rFonts w:cs="Times New Roman"/>
         </w:rPr>
-        <w:t>me reason and because random injection does not reach the same fault points every time. A false positive never occurred.</w:t>
+        <w:t xml:space="preserve"> of two (the kernel's own vm_struct legitimately points to it), so a single extra stale copy of its address hides the leak in that scan. The dynamic baselines vary for the same reason and because random injection does not reach the same fault points every time. A false positive never occurred.</w:t>
       </w:r>
     </w:p>
     <w:p>
@@ -21167,11 +21166,11 @@
         <w:tblLook w:val="04A0" w:firstRow="1" w:lastRow="0" w:firstColumn="1" w:lastColumn="0" w:noHBand="0" w:noVBand="1"/>
       </w:tblPr>
       <w:tblGrid>
-        <w:gridCol w:w="1128"/>
+        <w:gridCol w:w="1130"/>
         <w:gridCol w:w="2026"/>
         <w:gridCol w:w="1692"/>
-        <w:gridCol w:w="2142"/>
-        <w:gridCol w:w="2028"/>
+        <w:gridCol w:w="2141"/>
+        <w:gridCol w:w="2027"/>
       </w:tblGrid>
       <w:tr>
         <w:trPr>
@@ -21380,6 +21379,7 @@
                 <w:rFonts w:cs="Times New Roman"/>
                 <w:sz w:val="20"/>
               </w:rPr>
+              <w:lastRenderedPageBreak/>
               <w:t>Run 2</w:t>
             </w:r>
           </w:p>
@@ -21543,6 +21543,96 @@
           </w:p>
         </w:tc>
       </w:tr>
+      <w:tr>
+        <w:trPr>
+          <w:jc w:val="center"/>
+        </w:trPr>
+        <w:tc>
+          <w:tcPr>
+            <w:tcW w:w="1134" w:type="dxa"/>
+          </w:tcPr>
+          <w:p>
+            <w:pPr>
+              <w:spacing w:after="40" w:line="240" w:lineRule="auto"/>
+            </w:pPr>
+            <w:r>
+              <w:rPr>
+                <w:rFonts w:cs="Times New Roman"/>
+                <w:sz w:val="20"/>
+              </w:rPr>
+              <w:t>Final (main results)</w:t>
+            </w:r>
+          </w:p>
+        </w:tc>
+        <w:tc>
+          <w:tcPr>
+            <w:tcW w:w="2041" w:type="dxa"/>
+          </w:tcPr>
+          <w:p>
+            <w:pPr>
+              <w:spacing w:after="40" w:line="240" w:lineRule="auto"/>
+            </w:pPr>
+            <w:r>
+              <w:rPr>
+                <w:rFonts w:cs="Times New Roman"/>
+                <w:sz w:val="20"/>
+              </w:rPr>
+              <w:t>15 / 0 / 2</w:t>
+            </w:r>
+          </w:p>
+        </w:tc>
+        <w:tc>
+          <w:tcPr>
+            <w:tcW w:w="1701" w:type="dxa"/>
+          </w:tcPr>
+          <w:p>
+            <w:pPr>
+              <w:spacing w:after="40" w:line="240" w:lineRule="auto"/>
+            </w:pPr>
+            <w:r>
+              <w:rPr>
+                <w:rFonts w:cs="Times New Roman"/>
+                <w:sz w:val="20"/>
+              </w:rPr>
+              <w:t>16 / 0 / 1</w:t>
+            </w:r>
+          </w:p>
+        </w:tc>
+        <w:tc>
+          <w:tcPr>
+            <w:tcW w:w="2154" w:type="dxa"/>
+          </w:tcPr>
+          <w:p>
+            <w:pPr>
+              <w:spacing w:after="40" w:line="240" w:lineRule="auto"/>
+            </w:pPr>
+            <w:r>
+              <w:rPr>
+                <w:rFonts w:cs="Times New Roman"/>
+                <w:sz w:val="20"/>
+              </w:rPr>
+              <w:t>16 / 0 / 1</w:t>
+            </w:r>
+          </w:p>
+        </w:tc>
+        <w:tc>
+          <w:tcPr>
+            <w:tcW w:w="2041" w:type="dxa"/>
+          </w:tcPr>
+          <w:p>
+            <w:pPr>
+              <w:spacing w:after="40" w:line="240" w:lineRule="auto"/>
+            </w:pPr>
+            <w:r>
+              <w:rPr>
+                <w:rFonts w:cs="Times New Roman"/>
+                <w:sz w:val="20"/>
+              </w:rPr>
+              <w:t>14 / 0 / 3</w:t>
+            </w:r>
+          </w:p>
+        </w:tc>
+      </w:tr>
     </w:tbl>
     <w:p>
       <w:pPr>
@@ -21553,9 +21643,8 @@
       <w:pPr>
         <w:pStyle w:val="Heading2"/>
       </w:pPr>
-      <w:bookmarkStart w:id="22" w:name="_Toc243427992"/>
-      <w:r>
-        <w:lastRenderedPageBreak/>
+      <w:bookmarkStart w:id="22" w:name="_Toc243686846"/>
+      <w:r>
         <w:t>4.4 Evaluation on Real Kernel Code</w:t>
       </w:r>
       <w:bookmarkEnd w:id="22"/>
@@ -21841,6 +21930,7 @@
                 <w:rFonts w:cs="Times New Roman"/>
                 <w:sz w:val="18"/>
               </w:rPr>
+              <w:lastRenderedPageBreak/>
               <w:t>conditions on values that are constant on the path resolved (clang cleanup destinations, error codes kept in a variable)</w:t>
             </w:r>
           </w:p>
@@ -21877,20 +21967,13 @@
         <w:rPr>
           <w:rFonts w:cs="Times New Roman"/>
         </w:rPr>
-        <w:t xml:space="preserve">The runtime stage was run on all 39 modules (affs, bonding, brd, cramfs, dm_delay, dm_dust, dm_flakey, dummy, erofs, exfat, f2fs, geneve, hfs, hfsplus, ipvlan, jfs, mac80211_hwsim, </w:t>
+        <w:t>The runtime stage was run on all 39 modules (affs, bonding, brd, cramfs, dm_delay, dm_dust, dm_flakey, dummy, erofs, exfat, f2fs, geneve, hfs, hfsplus, ipvlan, jfs, mac80211_hwsim, macvlan, minix, netdevsim, nilfs2, nlmon, ntfs3, null_blk, omfs, qnx4, romfs, scsi_debug, snd_aloop, snd_dummy, squashfs, team, tun, udf, ufs, uinput, veth, vxlan, zram). Hardware virtualization was unavailable in WSL during this run (Windows virtualization-based security), so the guest ran under QEMU software emulation, which is</w:t>
       </w:r>
       <w:r>
         <w:rPr>
           <w:rFonts w:cs="Times New Roman"/>
         </w:rPr>
-        <w:lastRenderedPageBreak/>
-        <w:t>macvlan, minix, netdevsim, nilfs2, nlmon, ntfs3, null_blk, omfs, qnx4, romfs, scsi_debug, snd_aloop, snd_dummy, squashfs, team, tun, udf, ufs, uinput, veth, vxlan, zram). Hardware virtualization was unavailable in WSL during this run (Windows virtualization-based security), so the guest ran under QEMU software emulation, which is correct but 10-20x slower. For each module the mapping run failed every fault point of its initialisation reachable from the module's own code (library modules without an initialis</w:t>
-      </w:r>
-      <w:r>
-        <w:rPr>
-          <w:rFonts w:cs="Times New Roman"/>
-        </w:rPr>
-        <w:t>ation routine have none), with kmemleak checked after each module, and every static warning was given a targeted confirmation test.</w:t>
+        <w:t xml:space="preserve"> correct but 10-20x slower. For each module the mapping run failed every fault point of its initialisation reachable from the module's own code (library modules without an initialisation routine have none), with kmemleak checked after each module, and every static warning was given a targeted confirmation test.</w:t>
       </w:r>
     </w:p>
     <w:p>
@@ -26170,6 +26253,7 @@
                 <w:rFonts w:cs="Times New Roman"/>
                 <w:sz w:val="17"/>
               </w:rPr>
+              <w:lastRenderedPageBreak/>
               <w:t>udf</w:t>
             </w:r>
           </w:p>
@@ -26912,7 +26996,6 @@
           <w:rFonts w:cs="Times New Roman"/>
           <w:b/>
         </w:rPr>
-        <w:lastRenderedPageBreak/>
         <w:t>Manual review.</w:t>
       </w:r>
       <w:r>
@@ -26985,7 +27068,14 @@
         <w:rPr>
           <w:rFonts w:cs="Times New Roman"/>
         </w:rPr>
-        <w:t>est, is: sysfs_slab_add() returns before kobject_init_and_add() when create_unique_id() fails, so the cache's kobject is never initialised; do_kmem_cache_create() treats sysfs failure as non-fatal and keeps the cache; kmem_cache_destroy() unlinks the cache and calls kobject_put() on the uninitialised kobject: WARN, refcount underflow, kmem_cache_release() never runs; the struct kmem_cache, its per-node structures and its name stay allocated and unreferenced. The kernel's own warning at destruction time show</w:t>
+        <w:t xml:space="preserve">est, is: sysfs_slab_add() returns before kobject_init_and_add() when create_unique_id() fails, so the cache's kobject is never initialised; do_kmem_cache_create() treats sysfs failure as non-fatal and keeps the cache; kmem_cache_destroy() unlinks the cache and calls kobject_put() on the uninitialised kobject: WARN, refcount underflow, </w:t>
+      </w:r>
+      <w:r>
+        <w:rPr>
+          <w:rFonts w:cs="Times New Roman"/>
+        </w:rPr>
+        <w:lastRenderedPageBreak/>
+        <w:t>kmem_cache_release() never runs; the struct kmem_cache, its per-node structures and its name stay allocated and unreferenced. The kernel's own warning at destruction time show</w:t>
       </w:r>
       <w:r>
         <w:rPr>
@@ -27075,7 +27165,6 @@
           <w:rFonts w:ascii="Consolas" w:eastAsia="Consolas" w:hAnsi="Consolas" w:cs="Consolas"/>
           <w:sz w:val="16"/>
         </w:rPr>
-        <w:lastRenderedPageBreak/>
         <w:t xml:space="preserve">  do_syscall_64+0xc8/0x260</w:t>
       </w:r>
     </w:p>
@@ -27174,20 +27263,20 @@
         <w:rPr>
           <w:rFonts w:cs="Times New Roman"/>
         </w:rPr>
-        <w:t xml:space="preserve"> Of the remaining static warnings, the high-confidence one in ntfs3's log replay is a genuine leak: for an InitializeFileRecordSegment log record whose MFT record cannot be read (mi_get() fails), do_action() allocates a struct mft_inode with kzalloc(); mi_format_new() can fail (mi_init()'s buffer allocation, or ntfs_get_bh() after mi-&gt;mrec was allocated) and does not free mi; do_action() then returns the error without mi_put(): the mft_inode (and mi-&gt;mrec) leak; on success the object is released by mi_put()</w:t>
+        <w:t xml:space="preserve"> Of the remaining static warnings, the high-confidence one in ntfs3's log replay is a genuine leak: for an InitializeFileRecordSegment log record whose MFT </w:t>
       </w:r>
       <w:r>
         <w:rPr>
           <w:rFonts w:cs="Times New Roman"/>
         </w:rPr>
-        <w:t xml:space="preserve"> at the out label. The code is unchanged in mainline 7.3 and linux-next (next-20261020); a web search found no </w:t>
+        <w:lastRenderedPageBreak/>
+        <w:t>record cannot be read (mi_get() fails), do_action() allocates a struct mft_inode with kzalloc(); mi_format_new() can fail (mi_init()'s buffer allocation, or ntfs_get_bh() after mi-&gt;mrec was allocated) and does not free mi; do_action() then returns the error without mi_put(): the mft_inode (and mi-&gt;mrec) leak; on success the object is released by mi_put()</w:t>
       </w:r>
       <w:r>
         <w:rPr>
           <w:rFonts w:cs="Times New Roman"/>
         </w:rPr>
-        <w:lastRenderedPageBreak/>
-        <w:t>existing report or fix. Our fix (patches/0002-fs-ntfs3-free-mft_inode-when-mi_format_new-fails-in-do_action.patch) calls mi_put(mi) before returning; built against the guest kernel it compiles, and re-analysing the patched module removes exactly this warning (5 warnings before, 4 after, none new). It is not confirmed at runtime, which needs an NTFS image with a dirty log that replays InitializeFile</w:t>
+        <w:t xml:space="preserve"> at the out label. The code is unchanged in mainline 7.3 and linux-next (next-20261020); a web search found no existing report or fix. Our fix (patches/0002-fs-ntfs3-free-mft_inode-when-mi_format_new-fails-in-do_action.patch) calls mi_put(mi) before returning; built against the guest kernel it compiles, and re-analysing the patched module removes exactly this warning (5 warnings before, 4 after, none new). It is not confirmed at runtime, which needs an NTFS image with a dirty log that replays InitializeFile</w:t>
       </w:r>
       <w:r>
         <w:rPr>
@@ -27384,31 +27473,25 @@
           <w:rFonts w:cs="Times New Roman"/>
           <w:b/>
         </w:rPr>
+        <w:lastRenderedPageBreak/>
         <w:t>Root cause of the null_blk crash.</w:t>
       </w:r>
       <w:r>
         <w:rPr>
           <w:rFonts w:cs="Times New Roman"/>
         </w:rPr>
-        <w:t xml:space="preserve"> Probing fault points 739-745 one at a time on a freshly booted guest crashed it at 739, 741, 743, 745, so no earlier state is needed. With a verbose console the trigger is fail-nth 739 of null_blk init: kmalloc in configfs_register_subsystem(), after null_init() has added its disk. The mechanism: add_disk() -&gt; disk_scan_partitions() opens the whole disk (taking a module reference through disk-&gt;fops-&gt;owner) and drops it with fput(); </w:t>
+        <w:t xml:space="preserve"> Probing fault points 739-745 one at a time on a freshly booted guest crashed it at 739, 741, 743, 745, so no earlier state is needed. With a verbose console the trigger is fail-nth 739 of null_blk init: kmalloc in configfs_register_subsystem(), after null_init() has added its disk. The mechanism: add_disk() -&gt; disk_scan_partitions() opens the whole disk (taking a module reference through disk-&gt;fops-&gt;owner) and drops it with fput(); called from a user task (finit_module), the final __fput() is deferred to t</w:t>
       </w:r>
       <w:r>
         <w:rPr>
           <w:rFonts w:cs="Times New Roman"/>
         </w:rPr>
-        <w:lastRenderedPageBreak/>
-        <w:t>called from a user task (finit_module), the final __fput() is deferred to t</w:t>
+        <w:t>ask_work; configfs_register_subsystem() then fails; null_init() destroys its device and returns the error, and the module loader frees the module; on return to user space the deferred __fput() runs bdev_release(), whose module_put(disk-&gt;fops-&gt;owner) reads the freed module's block_device_operations. The crash stack confirms the deferred release (blkdev_release+0x11/0x20 &lt;- __fput+0xfe/0x280 &lt;- task_work_run+0x8b/0xb0 &lt;- exit_to_user_mode_loop+0xaa/0xc0). Any module that adds a disk and then fails its initial</w:t>
       </w:r>
       <w:r>
         <w:rPr>
           <w:rFonts w:cs="Times New Roman"/>
         </w:rPr>
-        <w:t>ask_work; configfs_register_subsystem() then fails; null_init() destroys its device and returns the error, and the module loader frees the module; on return to user space the deferred __fput() runs bdev_release(), whose module_put(disk-&gt;fops-&gt;owner) reads the freed module's block_device_operations. The crash stack confirms the deferred release (blkdev_release+0x11/0x20 &lt;- __fput+0xfe/0x280 &lt;- task_work_run+0x8b/0xb0 &lt;- exit_to_user_mode_loop+0xaa/0xc0). Any module that adds a disk and then fails its initial</w:t>
-      </w:r>
-      <w:r>
-        <w:rPr>
-          <w:rFonts w:cs="Times New Roman"/>
-        </w:rPr>
         <w:t>isation is exposed; the code is unchanged in mainline 7.3 (disk_scan_partitions() still uses fput(); null_init() still registers configfs after creating devices). We did not validate a fix: releasing the scan file synchronously (__fput_sync()) is documented as reserved for kernel threads; the fix belongs to the block / module-loader maintainers.</w:t>
       </w:r>
     </w:p>
@@ -27416,7 +27499,7 @@
       <w:pPr>
         <w:pStyle w:val="Heading2"/>
       </w:pPr>
-      <w:bookmarkStart w:id="23" w:name="_Toc243427993"/>
+      <w:bookmarkStart w:id="23" w:name="_Toc243686847"/>
       <w:r>
         <w:t>4.5 Seeded Leaks in Real Kernel Code</w:t>
       </w:r>
@@ -27870,20 +27953,14 @@
           <w:rFonts w:cs="Times New Roman"/>
           <w:b/>
         </w:rPr>
+        <w:lastRenderedPageBreak/>
         <w:t>bonding, bond_create() — upstream commit 8d6184e4881b "bonding: fix device leak on error in bond_create()" (2010-02-27).</w:t>
       </w:r>
       <w:r>
         <w:rPr>
           <w:rFonts w:cs="Times New Roman"/>
         </w:rPr>
-        <w:t xml:space="preserve"> A real bug that shipped in Linux until 2010: when register_netdevice() fails, bond_create() returns without free_netdev(), leaking the net_device allocated by alloc_netdev_mq(). Upstream commit 8d6184e4881b added the release; removing it from Linux 6.18.55 restores the original bug. bonding_init() calls bond_create() for each of max_bonds (default 1) at module load and propagates its error, so failing an allocation inside </w:t>
-      </w:r>
-      <w:r>
-        <w:rPr>
-          <w:rFonts w:cs="Times New Roman"/>
-        </w:rPr>
-        <w:lastRenderedPageBreak/>
-        <w:t>register_netdevice() with fail-nth makes initialisation fail and leaves the net_devic</w:t>
+        <w:t xml:space="preserve"> A real bug that shipped in Linux until 2010: when register_netdevice() fails, bond_create() returns without free_netdev(), leaking the net_device allocated by alloc_netdev_mq(). Upstream commit 8d6184e4881b added the release; removing it from Linux 6.18.55 restores the original bug. bonding_init() calls bond_create() for each of max_bonds (default 1) at module load and propagates its error, so failing an allocation inside register_netdevice() with fail-nth makes initialisation fail and leaves the net_devic</w:t>
       </w:r>
       <w:r>
         <w:rPr>
@@ -28093,7 +28170,14 @@
         <w:rPr>
           <w:rFonts w:cs="Times New Roman"/>
         </w:rPr>
-        <w:t>In the guest VM the module-filtered sweep mapped the failing call, and the targeted test (leak at main.c:799 after failing null_alloc_dev+0x63/0x210) made module initialisation fail; kmemleak then reported the object as unreferenced, with the allocation backtrace pointing back into the module's init path (module frames symbolised through klg_modwatch):</w:t>
+        <w:t xml:space="preserve">In the guest VM the module-filtered sweep mapped the failing call, and the targeted test (leak at main.c:799 after failing null_alloc_dev+0x63/0x210) made module initialisation fail; </w:t>
+      </w:r>
+      <w:r>
+        <w:rPr>
+          <w:rFonts w:cs="Times New Roman"/>
+        </w:rPr>
+        <w:lastRenderedPageBreak/>
+        <w:t>kmemleak then reported the object as unreferenced, with the allocation backtrace pointing back into the module's init path (module frames symbolised through klg_modwatch):</w:t>
       </w:r>
     </w:p>
     <w:p>
@@ -28205,7 +28289,6 @@
           <w:rFonts w:ascii="Consolas" w:eastAsia="Consolas" w:hAnsi="Consolas" w:cs="Consolas"/>
           <w:sz w:val="16"/>
         </w:rPr>
-        <w:lastRenderedPageBreak/>
         <w:t xml:space="preserve">  null_alloc_dev+0x1c/0x0 [null_blk]</w:t>
       </w:r>
     </w:p>
@@ -28273,7 +28356,7 @@
       <w:pPr>
         <w:pStyle w:val="Heading2"/>
       </w:pPr>
-      <w:bookmarkStart w:id="24" w:name="_Toc243427994"/>
+      <w:bookmarkStart w:id="24" w:name="_Toc243686848"/>
       <w:r>
         <w:t>4.6 Analysis</w:t>
       </w:r>
@@ -28318,20 +28401,20 @@
         <w:rPr>
           <w:rFonts w:cs="Times New Roman"/>
         </w:rPr>
-        <w:t xml:space="preserve"> Exhaustive fault injection runs every routine once per fault point (1261 executions, dominated by module loading, which has hundreds of fault points) and random injection uses a fixed budget. KernelLeakGuard restricts its sweep with the kernel's fault-injection stack-trace filter (require-start/require-end set to the module's code, taken from klg_modwatch's log), so fail-nth counts only fault points reached from the module itself; together with the targeted confirmation it needs 425 executions in total and</w:t>
+        <w:t xml:space="preserve"> Exhaustive fault injection runs every routine once per fault point (1279 executions, dominated by module loading, which has hundreds of fault points) and </w:t>
       </w:r>
       <w:r>
         <w:rPr>
           <w:rFonts w:cs="Times New Roman"/>
         </w:rPr>
-        <w:t xml:space="preserve"> finds 16 leaks, against 15 for the exhaustive baseline. Leaks in module initialisation code are reported by kmemleak with raw addresses because the module is unloaded after its failed initialisation; </w:t>
+        <w:lastRenderedPageBreak/>
+        <w:t>random injection uses a fixed budget. KernelLeakGuard restricts its sweep with the kernel's fault-injection stack-trace filter (require-start/require-end set to the module's code, taken from klg_modwatch's log), so fail-nth counts only fault points reached from the module itself; together with the targeted confirmation it needs 424 executions in total and</w:t>
       </w:r>
       <w:r>
         <w:rPr>
           <w:rFonts w:cs="Times New Roman"/>
         </w:rPr>
-        <w:lastRenderedPageBreak/>
-        <w:t>klg_modwatch, a helper module that logs each module's load address and symbols, turns them back into exact source lines. Dynamic tools report only a backtrace, whereas KernelLeakGuard's report names the leaking exit, the returned error, the failing call and a validated fix.</w:t>
+        <w:t xml:space="preserve"> finds 16 leaks, against 16 for the exhaustive baseline. Leaks in module initialisation code are reported by kmemleak with raw addresses because the module is unloaded after its failed initialisation; klg_modwatch, a helper module that logs each module's load address and symbols, turns them back into exact source lines. Dynamic tools report only a backtrace, whereas KernelLeakGuard's report names the leaking exit, the returned error, the failing call and a validated fix.</w:t>
       </w:r>
     </w:p>
     <w:p>
@@ -28400,7 +28483,7 @@
         <w:pageBreakBefore/>
         <w:jc w:val="center"/>
       </w:pPr>
-      <w:bookmarkStart w:id="25" w:name="_Toc243427995"/>
+      <w:bookmarkStart w:id="25" w:name="_Toc243686849"/>
       <w:r>
         <w:lastRenderedPageBreak/>
         <w:t>CHAPTER 5: CONCLUSION AND FUTURE WORK</w:t>
@@ -28411,7 +28494,7 @@
       <w:pPr>
         <w:pStyle w:val="Heading2"/>
       </w:pPr>
-      <w:bookmarkStart w:id="26" w:name="_Toc243427996"/>
+      <w:bookmarkStart w:id="26" w:name="_Toc243686850"/>
       <w:r>
         <w:t>5.1 Conclusion</w:t>
       </w:r>
@@ -28431,7 +28514,7 @@
         <w:rPr>
           <w:rFonts w:cs="Times New Roman"/>
         </w:rPr>
-        <w:t xml:space="preserve"> analysis, and runtime verification confirms 15 leaks with kernel evidence, refutes the remaining false positive and reaches precision 1.00. The complete tool finds 16 of 17 leaks with no false positive using 425 executions, compared with 15 leaks and 1261 executions for exhaustive fault injection, and generates validated fix patches for 14 of 15 confirmed leaks.</w:t>
+        <w:t xml:space="preserve"> analysis, and runtime verification confirms 15 leaks with kernel evidence, refutes the remaining false positive and reaches precision 1.00. The complete tool finds 16 of 17 leaks with no false positive using 424 executions, compared with 16 leaks and 1279 executions for exhaustive fault injection, and generates validated fix patches for 14 of 15 confirmed leaks.</w:t>
       </w:r>
     </w:p>
     <w:p>
@@ -28466,7 +28549,7 @@
       <w:pPr>
         <w:pStyle w:val="Heading2"/>
       </w:pPr>
-      <w:bookmarkStart w:id="27" w:name="_Toc243427997"/>
+      <w:bookmarkStart w:id="27" w:name="_Toc243686851"/>
       <w:r>
         <w:t>5.2 Future Work</w:t>
       </w:r>
@@ -28668,7 +28751,7 @@
         <w:pageBreakBefore/>
         <w:jc w:val="center"/>
       </w:pPr>
-      <w:bookmarkStart w:id="28" w:name="_Toc243427998"/>
+      <w:bookmarkStart w:id="28" w:name="_Toc243686852"/>
       <w:r>
         <w:lastRenderedPageBreak/>
         <w:t>REFERENCES</w:t>
@@ -28935,7 +29018,7 @@
         <w:pageBreakBefore/>
         <w:jc w:val="center"/>
       </w:pPr>
-      <w:bookmarkStart w:id="29" w:name="_Toc243427999"/>
+      <w:bookmarkStart w:id="29" w:name="_Toc243686853"/>
       <w:r>
         <w:lastRenderedPageBreak/>
         <w:t>APPENDIX: SOURCE CODE</w:t>
@@ -29372,7 +29455,7 @@
                 <w:rFonts w:cs="Times New Roman"/>
                 <w:sz w:val="20"/>
               </w:rPr>
-              <w:t>425</w:t>
+              <w:t>562</w:t>
             </w:r>
           </w:p>
         </w:tc>
@@ -36556,7 +36639,7 @@
     <w:autoRedefine/>
     <w:uiPriority w:val="39"/>
     <w:unhideWhenUsed/>
-    <w:rsid w:val="006E439D"/>
+    <w:rsid w:val="00E84FDB"/>
     <w:pPr>
       <w:spacing w:after="100"/>
     </w:pPr>
@@ -36568,7 +36651,7 @@
     <w:autoRedefine/>
     <w:uiPriority w:val="39"/>
     <w:unhideWhenUsed/>
-    <w:rsid w:val="006E439D"/>
+    <w:rsid w:val="00E84FDB"/>
     <w:pPr>
       <w:spacing w:after="100"/>
       <w:ind w:left="240"/>

</xml_diff>